<commit_message>
Añadida mas teoria al doc
</commit_message>
<xml_diff>
--- a/Códigos teoría/Grafos/Teoría de Grafos.docx
+++ b/Códigos teoría/Grafos/Teoría de Grafos.docx
@@ -268,49 +268,21 @@
           <w:rFonts w:ascii="Arial" w:eastAsia="FreeSerif" w:hAnsi="Arial" w:cs="Arial"/>
           <w:lang w:val="es-ES"/>
         </w:rPr>
-        <w:t xml:space="preserve"> son la </w:t>
+        <w:t xml:space="preserve"> son la unión de dos</w:t>
       </w:r>
       <w:r>
         <w:rPr>
           <w:rFonts w:ascii="Arial" w:eastAsia="FreeSerif" w:hAnsi="Arial" w:cs="Arial"/>
           <w:lang w:val="es-ES"/>
         </w:rPr>
-        <w:t>unión</w:t>
+        <w:t xml:space="preserve"> </w:t>
       </w:r>
       <w:r>
         <w:rPr>
           <w:rFonts w:ascii="Arial" w:eastAsia="FreeSerif" w:hAnsi="Arial" w:cs="Arial"/>
           <w:lang w:val="es-ES"/>
         </w:rPr>
-        <w:t xml:space="preserve"> de dos</w:t>
-      </w:r>
-      <w:r>
-        <w:rPr>
-          <w:rFonts w:ascii="Arial" w:eastAsia="FreeSerif" w:hAnsi="Arial" w:cs="Arial"/>
-          <w:lang w:val="es-ES"/>
-        </w:rPr>
-        <w:t xml:space="preserve"> </w:t>
-      </w:r>
-      <w:r>
-        <w:rPr>
-          <w:rFonts w:ascii="Arial" w:eastAsia="FreeSerif" w:hAnsi="Arial" w:cs="Arial"/>
-          <w:lang w:val="es-ES"/>
-        </w:rPr>
-        <w:t xml:space="preserve">grupos de </w:t>
-      </w:r>
-      <w:r>
-        <w:rPr>
-          <w:rFonts w:ascii="Arial" w:eastAsia="FreeSerif" w:hAnsi="Arial" w:cs="Arial"/>
-          <w:lang w:val="es-ES"/>
-        </w:rPr>
-        <w:t>vértices</w:t>
-      </w:r>
-      <w:r>
-        <w:rPr>
-          <w:rFonts w:ascii="Arial" w:eastAsia="FreeSerif" w:hAnsi="Arial" w:cs="Arial"/>
-          <w:lang w:val="es-ES"/>
-        </w:rPr>
-        <w:t>), bajo las siguientes condiciones:</w:t>
+        <w:t>grupos de vértices), bajo las siguientes condiciones:</w:t>
       </w:r>
     </w:p>
     <w:p>
@@ -357,21 +329,7 @@
           <w:rFonts w:ascii="Arial" w:eastAsia="FreeSerif" w:hAnsi="Arial" w:cs="Arial"/>
           <w:lang w:val="es-ES"/>
         </w:rPr>
-        <w:t xml:space="preserve"> son disjuntos y no </w:t>
-      </w:r>
-      <w:r>
-        <w:rPr>
-          <w:rFonts w:ascii="Arial" w:eastAsia="FreeSerif" w:hAnsi="Arial" w:cs="Arial"/>
-          <w:lang w:val="es-ES"/>
-        </w:rPr>
-        <w:t>vacíos</w:t>
-      </w:r>
-      <w:r>
-        <w:rPr>
-          <w:rFonts w:ascii="Arial" w:eastAsia="FreeSerif" w:hAnsi="Arial" w:cs="Arial"/>
-          <w:lang w:val="es-ES"/>
-        </w:rPr>
-        <w:t>.</w:t>
+        <w:t xml:space="preserve"> son disjuntos y no vacíos.</w:t>
       </w:r>
     </w:p>
     <w:p>
@@ -390,21 +348,7 @@
           <w:rFonts w:ascii="Arial" w:eastAsia="FreeSerif" w:hAnsi="Arial" w:cs="Arial"/>
           <w:lang w:val="es-ES"/>
         </w:rPr>
-        <w:t xml:space="preserve">• Cada arista de A une un </w:t>
-      </w:r>
-      <w:r>
-        <w:rPr>
-          <w:rFonts w:ascii="Arial" w:eastAsia="FreeSerif" w:hAnsi="Arial" w:cs="Arial"/>
-          <w:lang w:val="es-ES"/>
-        </w:rPr>
-        <w:t>vértice</w:t>
-      </w:r>
-      <w:r>
-        <w:rPr>
-          <w:rFonts w:ascii="Arial" w:eastAsia="FreeSerif" w:hAnsi="Arial" w:cs="Arial"/>
-          <w:lang w:val="es-ES"/>
-        </w:rPr>
-        <w:t xml:space="preserve"> de V1 con uno de V2.</w:t>
+        <w:t>• Cada arista de A une un vértice de V1 con uno de V2.</w:t>
       </w:r>
     </w:p>
     <w:p>
@@ -423,21 +367,7 @@
           <w:rFonts w:ascii="Arial" w:eastAsia="FreeSerif" w:hAnsi="Arial" w:cs="Arial"/>
           <w:lang w:val="es-ES"/>
         </w:rPr>
-        <w:t xml:space="preserve">• No existen aristas uniendo dos elementos de V1; </w:t>
-      </w:r>
-      <w:r>
-        <w:rPr>
-          <w:rFonts w:ascii="Arial" w:eastAsia="FreeSerif" w:hAnsi="Arial" w:cs="Arial"/>
-          <w:lang w:val="es-ES"/>
-        </w:rPr>
-        <w:t>análogamente</w:t>
-      </w:r>
-      <w:r>
-        <w:rPr>
-          <w:rFonts w:ascii="Arial" w:eastAsia="FreeSerif" w:hAnsi="Arial" w:cs="Arial"/>
-          <w:lang w:val="es-ES"/>
-        </w:rPr>
-        <w:t xml:space="preserve"> para V2.</w:t>
+        <w:t>• No existen aristas uniendo dos elementos de V1; análogamente para V2.</w:t>
       </w:r>
     </w:p>
     <w:p>
@@ -949,16 +879,7 @@
           <w:lang w:val="es-ES"/>
         </w:rPr>
         <w:lastRenderedPageBreak/>
-        <w:t>Ciclos y recorridos</w:t>
-      </w:r>
-      <w:r>
-        <w:rPr>
-          <w:rFonts w:ascii="Arial" w:eastAsia="FreeSerif" w:hAnsi="Arial" w:cs="Arial"/>
-          <w:b/>
-          <w:u w:val="single"/>
-          <w:lang w:val="es-ES"/>
-        </w:rPr>
-        <w:t xml:space="preserve"> de grafos</w:t>
+        <w:t>Grafo regular</w:t>
       </w:r>
     </w:p>
     <w:p>
@@ -982,6 +903,205 @@
         <w:adjustRightInd w:val="0"/>
         <w:spacing w:after="0" w:line="240" w:lineRule="auto"/>
         <w:rPr>
+          <w:rFonts w:ascii="Arial" w:hAnsi="Arial" w:cs="Arial"/>
+          <w:lang w:val="es-ES"/>
+        </w:rPr>
+      </w:pPr>
+      <w:r>
+        <w:rPr>
+          <w:rFonts w:ascii="Arial" w:hAnsi="Arial" w:cs="Arial"/>
+          <w:lang w:val="es-ES"/>
+        </w:rPr>
+        <w:t>U</w:t>
+      </w:r>
+      <w:r>
+        <w:rPr>
+          <w:rFonts w:ascii="Arial" w:hAnsi="Arial" w:cs="Arial"/>
+          <w:lang w:val="es-ES"/>
+        </w:rPr>
+        <w:t xml:space="preserve">n </w:t>
+      </w:r>
+      <w:r>
+        <w:rPr>
+          <w:rFonts w:ascii="Arial" w:hAnsi="Arial" w:cs="Arial"/>
+          <w:bCs/>
+          <w:lang w:val="es-ES"/>
+        </w:rPr>
+        <w:t>grafo regular</w:t>
+      </w:r>
+      <w:r>
+        <w:rPr>
+          <w:rFonts w:ascii="Arial" w:hAnsi="Arial" w:cs="Arial"/>
+          <w:lang w:val="es-ES"/>
+        </w:rPr>
+        <w:t xml:space="preserve"> es un </w:t>
+      </w:r>
+      <w:hyperlink r:id="rId10" w:tooltip="Grafo" w:history="1">
+        <w:r>
+          <w:rPr>
+            <w:rStyle w:val="Hipervnculo"/>
+            <w:rFonts w:ascii="Arial" w:hAnsi="Arial" w:cs="Arial"/>
+            <w:color w:val="auto"/>
+            <w:u w:val="none"/>
+            <w:lang w:val="es-ES"/>
+          </w:rPr>
+          <w:t>grafo</w:t>
+        </w:r>
+      </w:hyperlink>
+      <w:r>
+        <w:rPr>
+          <w:rFonts w:ascii="Arial" w:hAnsi="Arial" w:cs="Arial"/>
+          <w:lang w:val="es-ES"/>
+        </w:rPr>
+        <w:t xml:space="preserve"> donde c</w:t>
+      </w:r>
+      <w:r>
+        <w:rPr>
+          <w:rFonts w:ascii="Arial" w:hAnsi="Arial" w:cs="Arial"/>
+          <w:lang w:val="es-ES"/>
+        </w:rPr>
+        <w:t>ada vértice tiene el mismo grado</w:t>
+      </w:r>
+      <w:r>
+        <w:rPr>
+          <w:rFonts w:ascii="Arial" w:hAnsi="Arial" w:cs="Arial"/>
+          <w:lang w:val="es-ES"/>
+        </w:rPr>
+        <w:t xml:space="preserve">. Un grafo regular con vértices de grado </w:t>
+      </w:r>
+      <w:r>
+        <w:rPr>
+          <w:rFonts w:ascii="Arial" w:hAnsi="Arial" w:cs="Arial"/>
+          <w:i/>
+          <w:iCs/>
+          <w:lang w:val="es-ES"/>
+        </w:rPr>
+        <w:t>k</w:t>
+      </w:r>
+      <w:r>
+        <w:rPr>
+          <w:rFonts w:ascii="Arial" w:hAnsi="Arial" w:cs="Arial"/>
+          <w:lang w:val="es-ES"/>
+        </w:rPr>
+        <w:t xml:space="preserve"> es llamado grafo </w:t>
+      </w:r>
+      <w:r>
+        <w:rPr>
+          <w:rFonts w:ascii="Arial" w:hAnsi="Arial" w:cs="Arial"/>
+          <w:i/>
+          <w:iCs/>
+          <w:lang w:val="es-ES"/>
+        </w:rPr>
+        <w:t>k</w:t>
+      </w:r>
+      <w:r>
+        <w:rPr>
+          <w:rFonts w:ascii="Arial" w:hAnsi="Arial" w:cs="Arial"/>
+          <w:lang w:val="es-ES"/>
+        </w:rPr>
+        <w:t>-regular o grafo regular de grado k.</w:t>
+      </w:r>
+    </w:p>
+    <w:p>
+      <w:pPr>
+        <w:autoSpaceDE w:val="0"/>
+        <w:autoSpaceDN w:val="0"/>
+        <w:adjustRightInd w:val="0"/>
+        <w:spacing w:after="0" w:line="240" w:lineRule="auto"/>
+        <w:rPr>
+          <w:rFonts w:ascii="Arial" w:hAnsi="Arial" w:cs="Arial"/>
+          <w:lang w:val="es-ES"/>
+        </w:rPr>
+      </w:pPr>
+    </w:p>
+    <w:p>
+      <w:pPr>
+        <w:autoSpaceDE w:val="0"/>
+        <w:autoSpaceDN w:val="0"/>
+        <w:adjustRightInd w:val="0"/>
+        <w:spacing w:after="0" w:line="240" w:lineRule="auto"/>
+        <w:rPr>
+          <w:rFonts w:ascii="Arial" w:hAnsi="Arial" w:cs="Arial"/>
+          <w:lang w:val="es-ES"/>
+        </w:rPr>
+      </w:pPr>
+      <w:r>
+        <w:rPr>
+          <w:rFonts w:ascii="Arial" w:hAnsi="Arial" w:cs="Arial"/>
+          <w:lang w:val="es-ES"/>
+        </w:rPr>
+        <w:t>Para que un grafo sea de grado 1, la cantidad de nodos debe ser par.</w:t>
+      </w:r>
+    </w:p>
+    <w:p>
+      <w:pPr>
+        <w:autoSpaceDE w:val="0"/>
+        <w:autoSpaceDN w:val="0"/>
+        <w:adjustRightInd w:val="0"/>
+        <w:spacing w:after="0" w:line="240" w:lineRule="auto"/>
+        <w:rPr>
+          <w:rFonts w:ascii="Arial" w:hAnsi="Arial" w:cs="Arial"/>
+          <w:lang w:val="es-ES"/>
+        </w:rPr>
+      </w:pPr>
+      <w:r>
+        <w:rPr>
+          <w:rFonts w:ascii="Arial" w:hAnsi="Arial" w:cs="Arial"/>
+          <w:lang w:val="es-ES"/>
+        </w:rPr>
+        <w:t>Para que un grafo sea de grado 2, la cantidad de nodos puede ser par o impar.</w:t>
+      </w:r>
+    </w:p>
+    <w:p>
+      <w:pPr>
+        <w:autoSpaceDE w:val="0"/>
+        <w:autoSpaceDN w:val="0"/>
+        <w:adjustRightInd w:val="0"/>
+        <w:spacing w:after="0" w:line="240" w:lineRule="auto"/>
+        <w:rPr>
+          <w:rFonts w:ascii="Arial" w:hAnsi="Arial" w:cs="Arial"/>
+          <w:lang w:val="es-ES"/>
+        </w:rPr>
+      </w:pPr>
+    </w:p>
+    <w:p>
+      <w:pPr>
+        <w:autoSpaceDE w:val="0"/>
+        <w:autoSpaceDN w:val="0"/>
+        <w:adjustRightInd w:val="0"/>
+        <w:spacing w:after="0" w:line="240" w:lineRule="auto"/>
+        <w:rPr>
+          <w:rFonts w:ascii="Arial" w:hAnsi="Arial" w:cs="Arial"/>
+          <w:lang w:val="es-ES"/>
+        </w:rPr>
+      </w:pPr>
+      <w:r>
+        <w:rPr>
+          <w:rFonts w:ascii="Arial" w:hAnsi="Arial" w:cs="Arial"/>
+          <w:lang w:val="es-ES"/>
+        </w:rPr>
+        <w:t xml:space="preserve">En definitiva, si el grado es impar, la cantidad de nodos es par. Y si el grado es par, la cantidad de nodos puede ser par o impar. </w:t>
+      </w:r>
+    </w:p>
+    <w:p>
+      <w:pPr>
+        <w:autoSpaceDE w:val="0"/>
+        <w:autoSpaceDN w:val="0"/>
+        <w:adjustRightInd w:val="0"/>
+        <w:spacing w:after="0" w:line="240" w:lineRule="auto"/>
+        <w:rPr>
+          <w:rFonts w:ascii="Arial" w:hAnsi="Arial" w:cs="Arial"/>
+          <w:lang w:val="es-ES"/>
+        </w:rPr>
+      </w:pPr>
+    </w:p>
+    <w:p>
+      <w:pPr>
+        <w:autoSpaceDE w:val="0"/>
+        <w:autoSpaceDN w:val="0"/>
+        <w:adjustRightInd w:val="0"/>
+        <w:spacing w:after="0" w:line="240" w:lineRule="auto"/>
+        <w:rPr>
           <w:rFonts w:ascii="Arial" w:eastAsia="FreeSerif" w:hAnsi="Arial" w:cs="Arial"/>
           <w:b/>
           <w:u w:val="single"/>
@@ -993,9 +1113,90 @@
           <w:rFonts w:ascii="Arial" w:hAnsi="Arial" w:cs="Arial"/>
           <w:lang w:val="es-ES"/>
         </w:rPr>
+        <w:t>El grado de los nodos puede ser a lo sumo cantNodos-1.</w:t>
+      </w:r>
+    </w:p>
+    <w:p>
+      <w:pPr>
+        <w:autoSpaceDE w:val="0"/>
+        <w:autoSpaceDN w:val="0"/>
+        <w:adjustRightInd w:val="0"/>
+        <w:spacing w:after="0" w:line="240" w:lineRule="auto"/>
+        <w:rPr>
+          <w:rFonts w:ascii="Arial" w:eastAsia="FreeSerif" w:hAnsi="Arial" w:cs="Arial"/>
+          <w:b/>
+          <w:u w:val="single"/>
+          <w:lang w:val="es-ES"/>
+        </w:rPr>
+      </w:pPr>
+    </w:p>
+    <w:p>
+      <w:pPr>
+        <w:autoSpaceDE w:val="0"/>
+        <w:autoSpaceDN w:val="0"/>
+        <w:adjustRightInd w:val="0"/>
+        <w:spacing w:after="0" w:line="240" w:lineRule="auto"/>
+        <w:rPr>
+          <w:rFonts w:ascii="Arial" w:eastAsia="FreeSerif" w:hAnsi="Arial" w:cs="Arial"/>
+          <w:b/>
+          <w:u w:val="single"/>
+          <w:lang w:val="es-ES"/>
+        </w:rPr>
+      </w:pPr>
+      <w:r>
+        <w:rPr>
+          <w:rFonts w:ascii="Arial" w:eastAsia="FreeSerif" w:hAnsi="Arial" w:cs="Arial"/>
+          <w:b/>
+          <w:u w:val="single"/>
+          <w:lang w:val="es-ES"/>
+        </w:rPr>
+        <w:t>Ciclos y recorridos</w:t>
+      </w:r>
+      <w:r>
+        <w:rPr>
+          <w:rFonts w:ascii="Arial" w:eastAsia="FreeSerif" w:hAnsi="Arial" w:cs="Arial"/>
+          <w:b/>
+          <w:u w:val="single"/>
+          <w:lang w:val="es-ES"/>
+        </w:rPr>
+        <w:t xml:space="preserve"> de grafos</w:t>
+      </w:r>
+    </w:p>
+    <w:p>
+      <w:pPr>
+        <w:autoSpaceDE w:val="0"/>
+        <w:autoSpaceDN w:val="0"/>
+        <w:adjustRightInd w:val="0"/>
+        <w:spacing w:after="0" w:line="240" w:lineRule="auto"/>
+        <w:rPr>
+          <w:rFonts w:ascii="Arial" w:eastAsia="FreeSerif" w:hAnsi="Arial" w:cs="Arial"/>
+          <w:b/>
+          <w:u w:val="single"/>
+          <w:lang w:val="es-ES"/>
+        </w:rPr>
+      </w:pPr>
+    </w:p>
+    <w:p>
+      <w:pPr>
+        <w:autoSpaceDE w:val="0"/>
+        <w:autoSpaceDN w:val="0"/>
+        <w:adjustRightInd w:val="0"/>
+        <w:spacing w:after="0" w:line="240" w:lineRule="auto"/>
+        <w:rPr>
+          <w:rFonts w:ascii="Arial" w:eastAsia="FreeSerif" w:hAnsi="Arial" w:cs="Arial"/>
+          <w:b/>
+          <w:u w:val="single"/>
+          <w:lang w:val="es-ES"/>
+        </w:rPr>
+      </w:pPr>
+      <w:r>
+        <w:rPr>
+          <w:rFonts w:ascii="Arial" w:hAnsi="Arial" w:cs="Arial"/>
+          <w:lang w:val="es-ES"/>
+        </w:rPr>
         <w:t xml:space="preserve">La palabra ciclo se emplea en </w:t>
       </w:r>
-      <w:hyperlink r:id="rId10" w:tooltip="Teoría de grafos" w:history="1">
+      <w:hyperlink r:id="rId11" w:tooltip="Teoría de grafos" w:history="1">
         <w:r>
           <w:rPr>
             <w:rStyle w:val="Hipervnculo"/>
@@ -1255,14 +1456,7 @@
           <w:rFonts w:ascii="Arial" w:hAnsi="Arial" w:cs="Arial"/>
           <w:lang w:val="es-ES"/>
         </w:rPr>
-        <w:t>Un camino hamiltoniano es aquel</w:t>
-      </w:r>
-      <w:r>
-        <w:rPr>
-          <w:rFonts w:ascii="Arial" w:hAnsi="Arial" w:cs="Arial"/>
-          <w:lang w:val="es-ES"/>
-        </w:rPr>
-        <w:t xml:space="preserve"> que visita todos los vértices del grafo una sola vez. Si además el último vértice visitado es adyacente al primero, el camino es un ciclo hamiltoniano.</w:t>
+        <w:t>Un camino hamiltoniano es aquel que visita todos los vértices del grafo una sola vez. Si además el último vértice visitado es adyacente al primero, el camino es un ciclo hamiltoniano.</w:t>
       </w:r>
       <w:r>
         <w:rPr>
@@ -1271,7 +1465,7 @@
         </w:rPr>
         <w:t xml:space="preserve"> </w:t>
       </w:r>
-      <w:hyperlink r:id="rId11" w:tooltip="en:Hamiltonian path problem" w:history="1">
+      <w:hyperlink r:id="rId12" w:tooltip="en:Hamiltonian path problem" w:history="1">
         <w:r>
           <w:rPr>
             <w:rStyle w:val="Hipervnculo"/>
@@ -1290,7 +1484,7 @@
         </w:rPr>
         <w:t xml:space="preserve"> se sabe que es </w:t>
       </w:r>
-      <w:hyperlink r:id="rId12" w:tooltip="NP-completo" w:history="1">
+      <w:hyperlink r:id="rId13" w:tooltip="NP-completo" w:history="1">
         <w:r>
           <w:rPr>
             <w:rStyle w:val="Hipervnculo"/>
@@ -1475,60 +1669,7 @@
         <w:spacing w:before="100" w:beforeAutospacing="1" w:after="100" w:afterAutospacing="1" w:line="240" w:lineRule="auto"/>
         <w:rPr>
           <w:rFonts w:ascii="Arial" w:eastAsia="Times New Roman" w:hAnsi="Arial" w:cs="Arial"/>
-          <w:lang w:val="es-ES"/>
-        </w:rPr>
-      </w:pPr>
-    </w:p>
-    <w:p>
-      <w:pPr>
-        <w:spacing w:before="100" w:beforeAutospacing="1" w:after="100" w:afterAutospacing="1" w:line="240" w:lineRule="auto"/>
-        <w:rPr>
-          <w:rFonts w:ascii="Arial" w:eastAsia="Times New Roman" w:hAnsi="Arial" w:cs="Arial"/>
-          <w:lang w:val="es-ES"/>
-        </w:rPr>
-      </w:pPr>
-    </w:p>
-    <w:p>
-      <w:pPr>
-        <w:spacing w:before="100" w:beforeAutospacing="1" w:after="100" w:afterAutospacing="1" w:line="240" w:lineRule="auto"/>
-        <w:rPr>
-          <w:rFonts w:ascii="Arial" w:eastAsia="Times New Roman" w:hAnsi="Arial" w:cs="Arial"/>
-          <w:lang w:val="es-ES"/>
-        </w:rPr>
-      </w:pPr>
-    </w:p>
-    <w:p>
-      <w:pPr>
-        <w:spacing w:before="100" w:beforeAutospacing="1" w:after="100" w:afterAutospacing="1" w:line="240" w:lineRule="auto"/>
-        <w:rPr>
-          <w:rFonts w:ascii="Arial" w:eastAsia="Times New Roman" w:hAnsi="Arial" w:cs="Arial"/>
-          <w:lang w:val="es-ES"/>
-        </w:rPr>
-      </w:pPr>
-    </w:p>
-    <w:p>
-      <w:pPr>
-        <w:spacing w:before="100" w:beforeAutospacing="1" w:after="100" w:afterAutospacing="1" w:line="240" w:lineRule="auto"/>
-        <w:rPr>
-          <w:rFonts w:ascii="Arial" w:eastAsia="Times New Roman" w:hAnsi="Arial" w:cs="Arial"/>
-          <w:lang w:val="es-ES"/>
-        </w:rPr>
-      </w:pPr>
-    </w:p>
-    <w:p>
-      <w:pPr>
-        <w:spacing w:before="100" w:beforeAutospacing="1" w:after="100" w:afterAutospacing="1" w:line="240" w:lineRule="auto"/>
-        <w:rPr>
-          <w:rFonts w:ascii="Arial" w:eastAsia="Times New Roman" w:hAnsi="Arial" w:cs="Arial"/>
-          <w:lang w:val="es-ES"/>
-        </w:rPr>
-      </w:pPr>
-    </w:p>
-    <w:p>
-      <w:pPr>
-        <w:spacing w:before="100" w:beforeAutospacing="1" w:after="100" w:afterAutospacing="1" w:line="240" w:lineRule="auto"/>
-        <w:rPr>
-          <w:rFonts w:ascii="Arial" w:eastAsia="Times New Roman" w:hAnsi="Arial" w:cs="Arial"/>
+          <w:b/>
           <w:lang w:val="es-ES"/>
         </w:rPr>
       </w:pPr>
@@ -1875,23 +2016,7 @@
               <w:sz w:val="28"/>
               <w:szCs w:val="28"/>
             </w:rPr>
-            <m:t>D</m:t>
-          </m:r>
-          <m:r>
-            <w:rPr>
-              <w:rFonts w:ascii="Cambria Math" w:eastAsia="Times New Roman" w:hAnsi="Cambria Math" w:cs="Arial"/>
-              <w:sz w:val="28"/>
-              <w:szCs w:val="28"/>
-            </w:rPr>
-            <m:t>[i]</m:t>
-          </m:r>
-          <m:r>
-            <w:rPr>
-              <w:rFonts w:ascii="Cambria Math" w:eastAsia="Times New Roman" w:hAnsi="Cambria Math" w:cs="Arial"/>
-              <w:sz w:val="28"/>
-              <w:szCs w:val="28"/>
-            </w:rPr>
-            <m:t>=</m:t>
+            <m:t>D[i]=</m:t>
           </m:r>
           <m:func>
             <m:funcPr>
@@ -1914,29 +2039,7 @@
                   <w:sz w:val="28"/>
                   <w:szCs w:val="28"/>
                 </w:rPr>
-                <m:t>min</m:t>
-              </m:r>
-              <m:r>
-                <m:rPr>
-                  <m:sty m:val="p"/>
-                </m:rPr>
-                <w:rPr>
-                  <w:rFonts w:ascii="Cambria Math" w:eastAsia="Times New Roman" w:hAnsi="Cambria Math" w:cs="Arial"/>
-                  <w:sz w:val="28"/>
-                  <w:szCs w:val="28"/>
-                </w:rPr>
-                <m:t xml:space="preserve"> </m:t>
-              </m:r>
-              <m:r>
-                <m:rPr>
-                  <m:sty m:val="p"/>
-                </m:rPr>
-                <w:rPr>
-                  <w:rFonts w:ascii="Cambria Math" w:eastAsia="Times New Roman" w:hAnsi="Cambria Math" w:cs="Arial"/>
-                  <w:sz w:val="28"/>
-                  <w:szCs w:val="28"/>
-                </w:rPr>
-                <m:t>{</m:t>
+                <m:t>min {</m:t>
               </m:r>
             </m:fName>
             <m:e>
@@ -2213,6 +2316,7 @@
           <w:color w:val="000000"/>
           <w:sz w:val="20"/>
           <w:szCs w:val="20"/>
+          <w:lang w:val="es-ES"/>
         </w:rPr>
         <w:tab/>
       </w:r>
@@ -2234,25 +2338,7 @@
           <w:sz w:val="20"/>
           <w:szCs w:val="20"/>
         </w:rPr>
-        <w:t xml:space="preserve"> </w:t>
-      </w:r>
-      <w:r>
-        <w:rPr>
-          <w:rFonts w:ascii="Consolas" w:hAnsi="Consolas" w:cs="Consolas"/>
-          <w:color w:val="000000"/>
-          <w:sz w:val="20"/>
-          <w:szCs w:val="20"/>
-        </w:rPr>
-        <w:t>void</w:t>
-      </w:r>
-      <w:r>
-        <w:rPr>
-          <w:rFonts w:ascii="Consolas" w:hAnsi="Consolas" w:cs="Consolas"/>
-          <w:color w:val="000000"/>
-          <w:sz w:val="20"/>
-          <w:szCs w:val="20"/>
-        </w:rPr>
-        <w:t xml:space="preserve"> getCamino(</w:t>
+        <w:t xml:space="preserve"> void getCamino(</w:t>
       </w:r>
       <w:r>
         <w:rPr>
@@ -2303,6 +2389,7 @@
           <w:rFonts w:ascii="Consolas" w:hAnsi="Consolas" w:cs="Consolas"/>
           <w:sz w:val="20"/>
           <w:szCs w:val="20"/>
+          <w:lang w:val="es-ES"/>
         </w:rPr>
       </w:pPr>
       <w:r>
@@ -2331,6 +2418,7 @@
           <w:color w:val="7F0055"/>
           <w:sz w:val="20"/>
           <w:szCs w:val="20"/>
+          <w:lang w:val="es-ES"/>
         </w:rPr>
         <w:t>int</w:t>
       </w:r>
@@ -2340,6 +2428,7 @@
           <w:color w:val="000000"/>
           <w:sz w:val="20"/>
           <w:szCs w:val="20"/>
+          <w:lang w:val="es-ES"/>
         </w:rPr>
         <w:t xml:space="preserve"> </w:t>
       </w:r>
@@ -2349,6 +2438,7 @@
           <w:color w:val="6A3E3E"/>
           <w:sz w:val="20"/>
           <w:szCs w:val="20"/>
+          <w:lang w:val="es-ES"/>
         </w:rPr>
         <w:t>i</w:t>
       </w:r>
@@ -2358,6 +2448,7 @@
           <w:color w:val="000000"/>
           <w:sz w:val="20"/>
           <w:szCs w:val="20"/>
+          <w:lang w:val="es-ES"/>
         </w:rPr>
         <w:t xml:space="preserve"> = </w:t>
       </w:r>
@@ -2367,6 +2458,7 @@
           <w:color w:val="6A3E3E"/>
           <w:sz w:val="20"/>
           <w:szCs w:val="20"/>
+          <w:lang w:val="es-ES"/>
         </w:rPr>
         <w:t>nodoHasta</w:t>
       </w:r>
@@ -2376,6 +2468,7 @@
           <w:color w:val="000000"/>
           <w:sz w:val="20"/>
           <w:szCs w:val="20"/>
+          <w:lang w:val="es-ES"/>
         </w:rPr>
         <w:t>;</w:t>
       </w:r>
@@ -2385,6 +2478,7 @@
           <w:color w:val="000000"/>
           <w:sz w:val="20"/>
           <w:szCs w:val="20"/>
+          <w:lang w:val="es-ES"/>
         </w:rPr>
         <w:tab/>
       </w:r>
@@ -2394,6 +2488,7 @@
           <w:color w:val="000000"/>
           <w:sz w:val="20"/>
           <w:szCs w:val="20"/>
+          <w:lang w:val="es-ES"/>
         </w:rPr>
         <w:tab/>
       </w:r>
@@ -2408,14 +2503,16 @@
           <w:rFonts w:ascii="Consolas" w:hAnsi="Consolas" w:cs="Consolas"/>
           <w:sz w:val="20"/>
           <w:szCs w:val="20"/>
-        </w:rPr>
-      </w:pPr>
-      <w:r>
-        <w:rPr>
-          <w:rFonts w:ascii="Consolas" w:hAnsi="Consolas" w:cs="Consolas"/>
-          <w:color w:val="000000"/>
-          <w:sz w:val="20"/>
-          <w:szCs w:val="20"/>
+          <w:lang w:val="es-ES"/>
+        </w:rPr>
+      </w:pPr>
+      <w:r>
+        <w:rPr>
+          <w:rFonts w:ascii="Consolas" w:hAnsi="Consolas" w:cs="Consolas"/>
+          <w:color w:val="000000"/>
+          <w:sz w:val="20"/>
+          <w:szCs w:val="20"/>
+          <w:lang w:val="es-ES"/>
         </w:rPr>
         <w:tab/>
       </w:r>
@@ -2425,6 +2522,7 @@
           <w:color w:val="000000"/>
           <w:sz w:val="20"/>
           <w:szCs w:val="20"/>
+          <w:lang w:val="es-ES"/>
         </w:rPr>
         <w:tab/>
       </w:r>
@@ -2440,14 +2538,16 @@
           <w:color w:val="000000"/>
           <w:sz w:val="20"/>
           <w:szCs w:val="20"/>
-        </w:rPr>
-      </w:pPr>
-      <w:r>
-        <w:rPr>
-          <w:rFonts w:ascii="Consolas" w:hAnsi="Consolas" w:cs="Consolas"/>
-          <w:color w:val="000000"/>
-          <w:sz w:val="20"/>
-          <w:szCs w:val="20"/>
+          <w:lang w:val="es-ES"/>
+        </w:rPr>
+      </w:pPr>
+      <w:r>
+        <w:rPr>
+          <w:rFonts w:ascii="Consolas" w:hAnsi="Consolas" w:cs="Consolas"/>
+          <w:color w:val="000000"/>
+          <w:sz w:val="20"/>
+          <w:szCs w:val="20"/>
+          <w:lang w:val="es-ES"/>
         </w:rPr>
         <w:tab/>
       </w:r>
@@ -2457,6 +2557,7 @@
           <w:color w:val="000000"/>
           <w:sz w:val="20"/>
           <w:szCs w:val="20"/>
+          <w:lang w:val="es-ES"/>
         </w:rPr>
         <w:tab/>
       </w:r>
@@ -2468,6 +2569,7 @@
           <w:color w:val="7F0055"/>
           <w:sz w:val="20"/>
           <w:szCs w:val="20"/>
+          <w:lang w:val="es-ES"/>
         </w:rPr>
         <w:t>while</w:t>
       </w:r>
@@ -2477,6 +2579,7 @@
           <w:color w:val="000000"/>
           <w:sz w:val="20"/>
           <w:szCs w:val="20"/>
+          <w:lang w:val="es-ES"/>
         </w:rPr>
         <w:t xml:space="preserve"> (</w:t>
       </w:r>
@@ -2486,6 +2589,7 @@
           <w:color w:val="6A3E3E"/>
           <w:sz w:val="20"/>
           <w:szCs w:val="20"/>
+          <w:lang w:val="es-ES"/>
         </w:rPr>
         <w:t>i</w:t>
       </w:r>
@@ -2495,6 +2599,7 @@
           <w:color w:val="000000"/>
           <w:sz w:val="20"/>
           <w:szCs w:val="20"/>
+          <w:lang w:val="es-ES"/>
         </w:rPr>
         <w:t xml:space="preserve"> != </w:t>
       </w:r>
@@ -2504,6 +2609,7 @@
           <w:color w:val="0000C0"/>
           <w:sz w:val="20"/>
           <w:szCs w:val="20"/>
+          <w:lang w:val="es-ES"/>
         </w:rPr>
         <w:t>nodoInicial</w:t>
       </w:r>
@@ -2513,6 +2619,7 @@
           <w:color w:val="000000"/>
           <w:sz w:val="20"/>
           <w:szCs w:val="20"/>
+          <w:lang w:val="es-ES"/>
         </w:rPr>
         <w:t>) {</w:t>
       </w:r>
@@ -2536,6 +2643,7 @@
           <w:color w:val="000000"/>
           <w:sz w:val="20"/>
           <w:szCs w:val="20"/>
+          <w:lang w:val="es-ES"/>
         </w:rPr>
         <w:tab/>
       </w:r>
@@ -2545,6 +2653,7 @@
           <w:color w:val="000000"/>
           <w:sz w:val="20"/>
           <w:szCs w:val="20"/>
+          <w:lang w:val="es-ES"/>
         </w:rPr>
         <w:tab/>
       </w:r>
@@ -2554,6 +2663,7 @@
           <w:color w:val="000000"/>
           <w:sz w:val="20"/>
           <w:szCs w:val="20"/>
+          <w:lang w:val="es-ES"/>
         </w:rPr>
         <w:tab/>
       </w:r>
@@ -2649,6 +2759,7 @@
           <w:rFonts w:ascii="Consolas" w:hAnsi="Consolas" w:cs="Consolas"/>
           <w:sz w:val="20"/>
           <w:szCs w:val="20"/>
+          <w:lang w:val="es-ES"/>
         </w:rPr>
       </w:pPr>
       <w:r>
@@ -2687,6 +2798,7 @@
           <w:color w:val="6A3E3E"/>
           <w:sz w:val="20"/>
           <w:szCs w:val="20"/>
+          <w:lang w:val="es-ES"/>
         </w:rPr>
         <w:t>i</w:t>
       </w:r>
@@ -2696,6 +2808,7 @@
           <w:color w:val="000000"/>
           <w:sz w:val="20"/>
           <w:szCs w:val="20"/>
+          <w:lang w:val="es-ES"/>
         </w:rPr>
         <w:t xml:space="preserve"> = </w:t>
       </w:r>
@@ -2705,6 +2818,7 @@
           <w:color w:val="0000C0"/>
           <w:sz w:val="20"/>
           <w:szCs w:val="20"/>
+          <w:lang w:val="es-ES"/>
         </w:rPr>
         <w:t>predecesores</w:t>
       </w:r>
@@ -2714,6 +2828,7 @@
           <w:color w:val="000000"/>
           <w:sz w:val="20"/>
           <w:szCs w:val="20"/>
+          <w:lang w:val="es-ES"/>
         </w:rPr>
         <w:t>[</w:t>
       </w:r>
@@ -2723,6 +2838,7 @@
           <w:color w:val="6A3E3E"/>
           <w:sz w:val="20"/>
           <w:szCs w:val="20"/>
+          <w:lang w:val="es-ES"/>
         </w:rPr>
         <w:t>i</w:t>
       </w:r>
@@ -2732,6 +2848,7 @@
           <w:color w:val="000000"/>
           <w:sz w:val="20"/>
           <w:szCs w:val="20"/>
+          <w:lang w:val="es-ES"/>
         </w:rPr>
         <w:t>];</w:t>
       </w:r>
@@ -2746,6 +2863,7 @@
           <w:rFonts w:ascii="Consolas" w:hAnsi="Consolas" w:cs="Consolas"/>
           <w:sz w:val="20"/>
           <w:szCs w:val="20"/>
+          <w:lang w:val="es-ES"/>
         </w:rPr>
       </w:pPr>
     </w:p>
@@ -2759,14 +2877,16 @@
           <w:rFonts w:ascii="Consolas" w:hAnsi="Consolas" w:cs="Consolas"/>
           <w:sz w:val="20"/>
           <w:szCs w:val="20"/>
-        </w:rPr>
-      </w:pPr>
-      <w:r>
-        <w:rPr>
-          <w:rFonts w:ascii="Consolas" w:hAnsi="Consolas" w:cs="Consolas"/>
-          <w:color w:val="000000"/>
-          <w:sz w:val="20"/>
-          <w:szCs w:val="20"/>
+          <w:lang w:val="es-ES"/>
+        </w:rPr>
+      </w:pPr>
+      <w:r>
+        <w:rPr>
+          <w:rFonts w:ascii="Consolas" w:hAnsi="Consolas" w:cs="Consolas"/>
+          <w:color w:val="000000"/>
+          <w:sz w:val="20"/>
+          <w:szCs w:val="20"/>
+          <w:lang w:val="es-ES"/>
         </w:rPr>
         <w:tab/>
       </w:r>
@@ -2776,6 +2896,7 @@
           <w:color w:val="000000"/>
           <w:sz w:val="20"/>
           <w:szCs w:val="20"/>
+          <w:lang w:val="es-ES"/>
         </w:rPr>
         <w:tab/>
         <w:t>}</w:t>
@@ -2791,14 +2912,16 @@
           <w:rFonts w:ascii="Consolas" w:hAnsi="Consolas" w:cs="Consolas"/>
           <w:sz w:val="20"/>
           <w:szCs w:val="20"/>
-        </w:rPr>
-      </w:pPr>
-      <w:r>
-        <w:rPr>
-          <w:rFonts w:ascii="Consolas" w:hAnsi="Consolas" w:cs="Consolas"/>
-          <w:color w:val="000000"/>
-          <w:sz w:val="20"/>
-          <w:szCs w:val="20"/>
+          <w:lang w:val="es-ES"/>
+        </w:rPr>
+      </w:pPr>
+      <w:r>
+        <w:rPr>
+          <w:rFonts w:ascii="Consolas" w:hAnsi="Consolas" w:cs="Consolas"/>
+          <w:color w:val="000000"/>
+          <w:sz w:val="20"/>
+          <w:szCs w:val="20"/>
+          <w:lang w:val="es-ES"/>
         </w:rPr>
         <w:tab/>
         <w:t>}</w:t>
@@ -2818,118 +2941,133 @@
         <w:spacing w:before="100" w:beforeAutospacing="1" w:after="100" w:afterAutospacing="1" w:line="240" w:lineRule="auto"/>
         <w:rPr>
           <w:rFonts w:ascii="Arial" w:eastAsia="Times New Roman" w:hAnsi="Arial" w:cs="Arial"/>
-        </w:rPr>
-      </w:pPr>
-    </w:p>
-    <w:p>
-      <w:pPr>
-        <w:spacing w:before="100" w:beforeAutospacing="1" w:after="100" w:afterAutospacing="1" w:line="240" w:lineRule="auto"/>
-        <w:rPr>
-          <w:rFonts w:ascii="Arial" w:eastAsia="Times New Roman" w:hAnsi="Arial" w:cs="Arial"/>
-        </w:rPr>
-      </w:pPr>
-    </w:p>
-    <w:p>
-      <w:pPr>
-        <w:spacing w:before="100" w:beforeAutospacing="1" w:after="100" w:afterAutospacing="1" w:line="240" w:lineRule="auto"/>
-        <w:rPr>
-          <w:rFonts w:ascii="Arial" w:eastAsia="Times New Roman" w:hAnsi="Arial" w:cs="Arial"/>
-        </w:rPr>
-      </w:pPr>
-    </w:p>
-    <w:p>
-      <w:pPr>
-        <w:spacing w:before="100" w:beforeAutospacing="1" w:after="100" w:afterAutospacing="1" w:line="240" w:lineRule="auto"/>
-        <w:rPr>
-          <w:rFonts w:ascii="Arial" w:eastAsia="Times New Roman" w:hAnsi="Arial" w:cs="Arial"/>
-        </w:rPr>
-      </w:pPr>
-    </w:p>
-    <w:p>
-      <w:pPr>
-        <w:spacing w:before="100" w:beforeAutospacing="1" w:after="100" w:afterAutospacing="1" w:line="240" w:lineRule="auto"/>
-        <w:rPr>
-          <w:rFonts w:ascii="Arial" w:eastAsia="Times New Roman" w:hAnsi="Arial" w:cs="Arial"/>
-        </w:rPr>
-      </w:pPr>
-    </w:p>
-    <w:p>
-      <w:pPr>
-        <w:spacing w:before="100" w:beforeAutospacing="1" w:after="100" w:afterAutospacing="1" w:line="240" w:lineRule="auto"/>
-        <w:rPr>
-          <w:rFonts w:ascii="Arial" w:eastAsia="Times New Roman" w:hAnsi="Arial" w:cs="Arial"/>
-        </w:rPr>
-      </w:pPr>
-    </w:p>
-    <w:p>
-      <w:pPr>
-        <w:spacing w:before="100" w:beforeAutospacing="1" w:after="100" w:afterAutospacing="1" w:line="240" w:lineRule="auto"/>
-        <w:rPr>
-          <w:rFonts w:ascii="Arial" w:eastAsia="Times New Roman" w:hAnsi="Arial" w:cs="Arial"/>
-        </w:rPr>
-      </w:pPr>
-    </w:p>
-    <w:p>
-      <w:pPr>
-        <w:spacing w:before="100" w:beforeAutospacing="1" w:after="100" w:afterAutospacing="1" w:line="240" w:lineRule="auto"/>
-        <w:rPr>
-          <w:rFonts w:ascii="Arial" w:eastAsia="Times New Roman" w:hAnsi="Arial" w:cs="Arial"/>
-        </w:rPr>
-      </w:pPr>
-    </w:p>
-    <w:p>
-      <w:pPr>
-        <w:spacing w:before="100" w:beforeAutospacing="1" w:after="100" w:afterAutospacing="1" w:line="240" w:lineRule="auto"/>
-        <w:rPr>
-          <w:rFonts w:ascii="Arial" w:eastAsia="Times New Roman" w:hAnsi="Arial" w:cs="Arial"/>
-        </w:rPr>
-      </w:pPr>
-    </w:p>
-    <w:p>
-      <w:pPr>
-        <w:spacing w:before="100" w:beforeAutospacing="1" w:after="100" w:afterAutospacing="1" w:line="240" w:lineRule="auto"/>
-        <w:rPr>
-          <w:rFonts w:ascii="Arial" w:eastAsia="Times New Roman" w:hAnsi="Arial" w:cs="Arial"/>
-        </w:rPr>
-      </w:pPr>
-    </w:p>
-    <w:p>
-      <w:pPr>
-        <w:spacing w:before="100" w:beforeAutospacing="1" w:after="100" w:afterAutospacing="1" w:line="240" w:lineRule="auto"/>
-        <w:rPr>
-          <w:rFonts w:ascii="Arial" w:eastAsia="Times New Roman" w:hAnsi="Arial" w:cs="Arial"/>
-        </w:rPr>
-      </w:pPr>
-    </w:p>
-    <w:p>
-      <w:pPr>
-        <w:spacing w:before="100" w:beforeAutospacing="1" w:after="100" w:afterAutospacing="1" w:line="240" w:lineRule="auto"/>
-        <w:rPr>
-          <w:rFonts w:ascii="Arial" w:eastAsia="Times New Roman" w:hAnsi="Arial" w:cs="Arial"/>
-        </w:rPr>
-      </w:pPr>
-    </w:p>
-    <w:p>
-      <w:pPr>
-        <w:spacing w:before="100" w:beforeAutospacing="1" w:after="100" w:afterAutospacing="1" w:line="240" w:lineRule="auto"/>
-        <w:rPr>
-          <w:rFonts w:ascii="Arial" w:eastAsia="Times New Roman" w:hAnsi="Arial" w:cs="Arial"/>
-        </w:rPr>
-      </w:pPr>
-    </w:p>
-    <w:p>
-      <w:pPr>
-        <w:spacing w:before="100" w:beforeAutospacing="1" w:after="100" w:afterAutospacing="1" w:line="240" w:lineRule="auto"/>
-        <w:rPr>
-          <w:rFonts w:ascii="Arial" w:eastAsia="Times New Roman" w:hAnsi="Arial" w:cs="Arial"/>
-        </w:rPr>
-      </w:pPr>
-    </w:p>
-    <w:p>
-      <w:pPr>
-        <w:spacing w:before="100" w:beforeAutospacing="1" w:after="100" w:afterAutospacing="1" w:line="240" w:lineRule="auto"/>
-        <w:rPr>
-          <w:rFonts w:ascii="Arial" w:eastAsia="Times New Roman" w:hAnsi="Arial" w:cs="Arial"/>
+          <w:lang w:val="es-ES"/>
+        </w:rPr>
+      </w:pPr>
+    </w:p>
+    <w:p>
+      <w:pPr>
+        <w:spacing w:before="100" w:beforeAutospacing="1" w:after="100" w:afterAutospacing="1" w:line="240" w:lineRule="auto"/>
+        <w:rPr>
+          <w:rFonts w:ascii="Arial" w:eastAsia="Times New Roman" w:hAnsi="Arial" w:cs="Arial"/>
+          <w:lang w:val="es-ES"/>
+        </w:rPr>
+      </w:pPr>
+    </w:p>
+    <w:p>
+      <w:pPr>
+        <w:spacing w:before="100" w:beforeAutospacing="1" w:after="100" w:afterAutospacing="1" w:line="240" w:lineRule="auto"/>
+        <w:rPr>
+          <w:rFonts w:ascii="Arial" w:eastAsia="Times New Roman" w:hAnsi="Arial" w:cs="Arial"/>
+          <w:lang w:val="es-ES"/>
+        </w:rPr>
+      </w:pPr>
+    </w:p>
+    <w:p>
+      <w:pPr>
+        <w:spacing w:before="100" w:beforeAutospacing="1" w:after="100" w:afterAutospacing="1" w:line="240" w:lineRule="auto"/>
+        <w:rPr>
+          <w:rFonts w:ascii="Arial" w:eastAsia="Times New Roman" w:hAnsi="Arial" w:cs="Arial"/>
+          <w:lang w:val="es-ES"/>
+        </w:rPr>
+      </w:pPr>
+    </w:p>
+    <w:p>
+      <w:pPr>
+        <w:spacing w:before="100" w:beforeAutospacing="1" w:after="100" w:afterAutospacing="1" w:line="240" w:lineRule="auto"/>
+        <w:rPr>
+          <w:rFonts w:ascii="Arial" w:eastAsia="Times New Roman" w:hAnsi="Arial" w:cs="Arial"/>
+          <w:lang w:val="es-ES"/>
+        </w:rPr>
+      </w:pPr>
+    </w:p>
+    <w:p>
+      <w:pPr>
+        <w:spacing w:before="100" w:beforeAutospacing="1" w:after="100" w:afterAutospacing="1" w:line="240" w:lineRule="auto"/>
+        <w:rPr>
+          <w:rFonts w:ascii="Arial" w:eastAsia="Times New Roman" w:hAnsi="Arial" w:cs="Arial"/>
+          <w:lang w:val="es-ES"/>
+        </w:rPr>
+      </w:pPr>
+    </w:p>
+    <w:p>
+      <w:pPr>
+        <w:spacing w:before="100" w:beforeAutospacing="1" w:after="100" w:afterAutospacing="1" w:line="240" w:lineRule="auto"/>
+        <w:rPr>
+          <w:rFonts w:ascii="Arial" w:eastAsia="Times New Roman" w:hAnsi="Arial" w:cs="Arial"/>
+          <w:lang w:val="es-ES"/>
+        </w:rPr>
+      </w:pPr>
+    </w:p>
+    <w:p>
+      <w:pPr>
+        <w:spacing w:before="100" w:beforeAutospacing="1" w:after="100" w:afterAutospacing="1" w:line="240" w:lineRule="auto"/>
+        <w:rPr>
+          <w:rFonts w:ascii="Arial" w:eastAsia="Times New Roman" w:hAnsi="Arial" w:cs="Arial"/>
+          <w:lang w:val="es-ES"/>
+        </w:rPr>
+      </w:pPr>
+    </w:p>
+    <w:p>
+      <w:pPr>
+        <w:spacing w:before="100" w:beforeAutospacing="1" w:after="100" w:afterAutospacing="1" w:line="240" w:lineRule="auto"/>
+        <w:rPr>
+          <w:rFonts w:ascii="Arial" w:eastAsia="Times New Roman" w:hAnsi="Arial" w:cs="Arial"/>
+          <w:lang w:val="es-ES"/>
+        </w:rPr>
+      </w:pPr>
+    </w:p>
+    <w:p>
+      <w:pPr>
+        <w:spacing w:before="100" w:beforeAutospacing="1" w:after="100" w:afterAutospacing="1" w:line="240" w:lineRule="auto"/>
+        <w:rPr>
+          <w:rFonts w:ascii="Arial" w:eastAsia="Times New Roman" w:hAnsi="Arial" w:cs="Arial"/>
+          <w:lang w:val="es-ES"/>
+        </w:rPr>
+      </w:pPr>
+    </w:p>
+    <w:p>
+      <w:pPr>
+        <w:spacing w:before="100" w:beforeAutospacing="1" w:after="100" w:afterAutospacing="1" w:line="240" w:lineRule="auto"/>
+        <w:rPr>
+          <w:rFonts w:ascii="Arial" w:eastAsia="Times New Roman" w:hAnsi="Arial" w:cs="Arial"/>
+          <w:lang w:val="es-ES"/>
+        </w:rPr>
+      </w:pPr>
+    </w:p>
+    <w:p>
+      <w:pPr>
+        <w:spacing w:before="100" w:beforeAutospacing="1" w:after="100" w:afterAutospacing="1" w:line="240" w:lineRule="auto"/>
+        <w:rPr>
+          <w:rFonts w:ascii="Arial" w:eastAsia="Times New Roman" w:hAnsi="Arial" w:cs="Arial"/>
+          <w:lang w:val="es-ES"/>
+        </w:rPr>
+      </w:pPr>
+    </w:p>
+    <w:p>
+      <w:pPr>
+        <w:spacing w:before="100" w:beforeAutospacing="1" w:after="100" w:afterAutospacing="1" w:line="240" w:lineRule="auto"/>
+        <w:rPr>
+          <w:rFonts w:ascii="Arial" w:eastAsia="Times New Roman" w:hAnsi="Arial" w:cs="Arial"/>
+          <w:lang w:val="es-ES"/>
+        </w:rPr>
+      </w:pPr>
+    </w:p>
+    <w:p>
+      <w:pPr>
+        <w:spacing w:before="100" w:beforeAutospacing="1" w:after="100" w:afterAutospacing="1" w:line="240" w:lineRule="auto"/>
+        <w:rPr>
+          <w:rFonts w:ascii="Arial" w:eastAsia="Times New Roman" w:hAnsi="Arial" w:cs="Arial"/>
+          <w:lang w:val="es-ES"/>
+        </w:rPr>
+      </w:pPr>
+    </w:p>
+    <w:p>
+      <w:pPr>
+        <w:spacing w:before="100" w:beforeAutospacing="1" w:after="100" w:afterAutospacing="1" w:line="240" w:lineRule="auto"/>
+        <w:rPr>
+          <w:rFonts w:ascii="Arial" w:eastAsia="Times New Roman" w:hAnsi="Arial" w:cs="Arial"/>
+          <w:lang w:val="es-ES"/>
         </w:rPr>
       </w:pPr>
     </w:p>
@@ -2982,7 +3120,7 @@
         </w:rPr>
         <w:t xml:space="preserve"> es un </w:t>
       </w:r>
-      <w:hyperlink r:id="rId13" w:tooltip="Algoritmo" w:history="1">
+      <w:hyperlink r:id="rId14" w:tooltip="Algoritmo" w:history="1">
         <w:r>
           <w:rPr>
             <w:rStyle w:val="Hipervnculo"/>
@@ -3001,7 +3139,7 @@
         </w:rPr>
         <w:t xml:space="preserve"> para encontrar un </w:t>
       </w:r>
-      <w:hyperlink r:id="rId14" w:tooltip="Árbol recubridor mínimo" w:history="1">
+      <w:hyperlink r:id="rId15" w:tooltip="Árbol recubridor mínimo" w:history="1">
         <w:r>
           <w:rPr>
             <w:rStyle w:val="Hipervnculo"/>
@@ -3513,21 +3651,24 @@
         <w:rPr>
           <w:rFonts w:ascii="Arial" w:eastAsia="Times New Roman" w:hAnsi="Arial" w:cs="Arial"/>
           <w:b/>
-        </w:rPr>
-      </w:pPr>
-    </w:p>
-    <w:p>
-      <w:pPr>
-        <w:spacing w:before="100" w:beforeAutospacing="1" w:after="100" w:afterAutospacing="1" w:line="240" w:lineRule="auto"/>
-        <w:rPr>
-          <w:rFonts w:ascii="Arial" w:eastAsia="Times New Roman" w:hAnsi="Arial" w:cs="Arial"/>
-          <w:b/>
-        </w:rPr>
-      </w:pPr>
-      <w:r>
-        <w:rPr>
-          <w:rFonts w:ascii="Arial" w:eastAsia="Times New Roman" w:hAnsi="Arial" w:cs="Arial"/>
-          <w:b/>
+          <w:lang w:val="es-ES"/>
+        </w:rPr>
+      </w:pPr>
+    </w:p>
+    <w:p>
+      <w:pPr>
+        <w:spacing w:before="100" w:beforeAutospacing="1" w:after="100" w:afterAutospacing="1" w:line="240" w:lineRule="auto"/>
+        <w:rPr>
+          <w:rFonts w:ascii="Arial" w:eastAsia="Times New Roman" w:hAnsi="Arial" w:cs="Arial"/>
+          <w:b/>
+          <w:lang w:val="es-ES"/>
+        </w:rPr>
+      </w:pPr>
+      <w:r>
+        <w:rPr>
+          <w:rFonts w:ascii="Arial" w:eastAsia="Times New Roman" w:hAnsi="Arial" w:cs="Arial"/>
+          <w:b/>
+          <w:lang w:val="es-ES"/>
         </w:rPr>
         <w:lastRenderedPageBreak/>
         <w:t>¿Cómo funcionan makeSet, find, y union?</w:t>
@@ -3582,6 +3723,7 @@
           <w:color w:val="000000"/>
           <w:sz w:val="20"/>
           <w:szCs w:val="20"/>
+          <w:lang w:val="es-ES"/>
         </w:rPr>
         <w:tab/>
       </w:r>
@@ -4053,6 +4195,7 @@
           <w:color w:val="000000"/>
           <w:sz w:val="20"/>
           <w:szCs w:val="20"/>
+          <w:lang w:val="es-ES"/>
         </w:rPr>
         <w:tab/>
       </w:r>
@@ -4534,6 +4677,7 @@
           <w:rFonts w:ascii="Consolas" w:hAnsi="Consolas" w:cs="Consolas"/>
           <w:sz w:val="20"/>
           <w:szCs w:val="20"/>
+          <w:lang w:val="es-ES"/>
         </w:rPr>
       </w:pPr>
       <w:r>
@@ -4544,6 +4688,15 @@
           <w:szCs w:val="20"/>
         </w:rPr>
         <w:tab/>
+      </w:r>
+      <w:r>
+        <w:rPr>
+          <w:rFonts w:ascii="Consolas" w:hAnsi="Consolas" w:cs="Consolas"/>
+          <w:color w:val="000000"/>
+          <w:sz w:val="20"/>
+          <w:szCs w:val="20"/>
+          <w:lang w:val="es-ES"/>
+        </w:rPr>
         <w:t>}</w:t>
       </w:r>
     </w:p>
@@ -5398,6 +5551,7 @@
           <w:rFonts w:ascii="Consolas" w:hAnsi="Consolas" w:cs="Consolas"/>
           <w:sz w:val="20"/>
           <w:szCs w:val="20"/>
+          <w:lang w:val="es-ES"/>
         </w:rPr>
       </w:pPr>
       <w:r>
@@ -5426,6 +5580,7 @@
           <w:color w:val="000000"/>
           <w:sz w:val="20"/>
           <w:szCs w:val="20"/>
+          <w:lang w:val="es-ES"/>
         </w:rPr>
         <w:t>}</w:t>
       </w:r>
@@ -5444,6 +5599,7 @@
           <w:color w:val="000000"/>
           <w:sz w:val="20"/>
           <w:szCs w:val="20"/>
+          <w:lang w:val="es-ES"/>
         </w:rPr>
         <w:tab/>
         <w:t>}</w:t>
@@ -5552,7 +5708,7 @@
         </w:rPr>
         <w:t xml:space="preserve"> es un </w:t>
       </w:r>
-      <w:hyperlink r:id="rId15" w:tooltip="Algoritmo" w:history="1">
+      <w:hyperlink r:id="rId16" w:tooltip="Algoritmo" w:history="1">
         <w:r>
           <w:rPr>
             <w:rStyle w:val="Hipervnculo"/>
@@ -5571,7 +5727,7 @@
         </w:rPr>
         <w:t xml:space="preserve"> para encontrar un </w:t>
       </w:r>
-      <w:hyperlink r:id="rId16" w:tooltip="Árbol recubridor mínimo" w:history="1">
+      <w:hyperlink r:id="rId17" w:tooltip="Árbol recubridor mínimo" w:history="1">
         <w:r>
           <w:rPr>
             <w:rStyle w:val="Hipervnculo"/>
@@ -5590,7 +5746,7 @@
         </w:rPr>
         <w:t xml:space="preserve"> en un </w:t>
       </w:r>
-      <w:hyperlink r:id="rId17" w:tooltip="Grafo" w:history="1">
+      <w:hyperlink r:id="rId18" w:tooltip="Grafo" w:history="1">
         <w:r>
           <w:rPr>
             <w:rStyle w:val="Hipervnculo"/>
@@ -5609,7 +5765,7 @@
         </w:rPr>
         <w:t xml:space="preserve"> </w:t>
       </w:r>
-      <w:hyperlink r:id="rId18" w:anchor="Grafos_conexos" w:tooltip="Teoría de los grafos" w:history="1">
+      <w:hyperlink r:id="rId19" w:anchor="Grafos_conexos" w:tooltip="Teoría de los grafos" w:history="1">
         <w:r>
           <w:rPr>
             <w:rStyle w:val="Hipervnculo"/>
@@ -5643,7 +5799,7 @@
         </w:rPr>
         <w:t xml:space="preserve"> dirigido y cuyas </w:t>
       </w:r>
-      <w:hyperlink r:id="rId19" w:tooltip="Arista (Teoría de grafos)" w:history="1">
+      <w:hyperlink r:id="rId20" w:tooltip="Arista (Teoría de grafos)" w:history="1">
         <w:r>
           <w:rPr>
             <w:rStyle w:val="Hipervnculo"/>
@@ -7012,15 +7168,7 @@
           <w:lang w:val="es-ES"/>
         </w:rPr>
         <w:lastRenderedPageBreak/>
-        <w:t xml:space="preserve">Algoritmo </w:t>
-      </w:r>
-      <w:r>
-        <w:rPr>
-          <w:rFonts w:ascii="Arial" w:eastAsia="Times New Roman" w:hAnsi="Arial" w:cs="Arial"/>
-          <w:b/>
-          <w:lang w:val="es-ES"/>
-        </w:rPr>
-        <w:t>de Floyd</w:t>
+        <w:t>Algoritmo de Floyd</w:t>
       </w:r>
     </w:p>
     <w:p>
@@ -7535,47 +7683,7 @@
               <w:sz w:val="28"/>
               <w:szCs w:val="28"/>
             </w:rPr>
-            <m:t>F</m:t>
-          </m:r>
-          <m:r>
-            <w:rPr>
-              <w:rFonts w:ascii="Cambria Math" w:eastAsia="Times New Roman" w:hAnsi="Cambria Math" w:cs="Arial"/>
-              <w:sz w:val="28"/>
-              <w:szCs w:val="28"/>
-            </w:rPr>
-            <m:t>k</m:t>
-          </m:r>
-          <m:r>
-            <w:rPr>
-              <w:rFonts w:ascii="Cambria Math" w:eastAsia="Times New Roman" w:hAnsi="Cambria Math" w:cs="Arial"/>
-              <w:sz w:val="28"/>
-              <w:szCs w:val="28"/>
-            </w:rPr>
-            <m:t>[</m:t>
-          </m:r>
-          <m:r>
-            <w:rPr>
-              <w:rFonts w:ascii="Cambria Math" w:eastAsia="Times New Roman" w:hAnsi="Cambria Math" w:cs="Arial"/>
-              <w:sz w:val="28"/>
-              <w:szCs w:val="28"/>
-            </w:rPr>
-            <m:t>i,j</m:t>
-          </m:r>
-          <m:r>
-            <w:rPr>
-              <w:rFonts w:ascii="Cambria Math" w:eastAsia="Times New Roman" w:hAnsi="Cambria Math" w:cs="Arial"/>
-              <w:sz w:val="28"/>
-              <w:szCs w:val="28"/>
-            </w:rPr>
-            <m:t>]</m:t>
-          </m:r>
-          <m:r>
-            <w:rPr>
-              <w:rFonts w:ascii="Cambria Math" w:eastAsia="Times New Roman" w:hAnsi="Cambria Math" w:cs="Arial"/>
-              <w:sz w:val="28"/>
-              <w:szCs w:val="28"/>
-            </w:rPr>
-            <m:t>=</m:t>
+            <m:t>Fk[i,j]=</m:t>
           </m:r>
           <m:func>
             <m:funcPr>
@@ -7598,29 +7706,7 @@
                   <w:sz w:val="28"/>
                   <w:szCs w:val="28"/>
                 </w:rPr>
-                <m:t>min</m:t>
-              </m:r>
-              <m:r>
-                <m:rPr>
-                  <m:sty m:val="p"/>
-                </m:rPr>
-                <w:rPr>
-                  <w:rFonts w:ascii="Cambria Math" w:eastAsia="Times New Roman" w:hAnsi="Cambria Math" w:cs="Arial"/>
-                  <w:sz w:val="28"/>
-                  <w:szCs w:val="28"/>
-                </w:rPr>
-                <m:t xml:space="preserve"> </m:t>
-              </m:r>
-              <m:r>
-                <m:rPr>
-                  <m:sty m:val="p"/>
-                </m:rPr>
-                <w:rPr>
-                  <w:rFonts w:ascii="Cambria Math" w:eastAsia="Times New Roman" w:hAnsi="Cambria Math" w:cs="Arial"/>
-                  <w:sz w:val="28"/>
-                  <w:szCs w:val="28"/>
-                </w:rPr>
-                <m:t>{</m:t>
+                <m:t>min {</m:t>
               </m:r>
             </m:fName>
             <m:e>
@@ -7642,15 +7728,7 @@
                       <w:sz w:val="28"/>
                       <w:szCs w:val="28"/>
                     </w:rPr>
-                    <m:t xml:space="preserve"> </m:t>
-                  </m:r>
-                  <m:r>
-                    <w:rPr>
-                      <w:rFonts w:ascii="Cambria Math" w:eastAsia="Times New Roman" w:hAnsi="Cambria Math" w:cs="Arial"/>
-                      <w:sz w:val="28"/>
-                      <w:szCs w:val="28"/>
-                    </w:rPr>
-                    <m:t>Fk</m:t>
+                    <m:t xml:space="preserve"> Fk</m:t>
                   </m:r>
                   <m:d>
                     <m:dPr>
@@ -7672,15 +7750,7 @@
                           <w:sz w:val="28"/>
                           <w:szCs w:val="28"/>
                         </w:rPr>
-                        <m:t>i</m:t>
-                      </m:r>
-                      <m:r>
-                        <w:rPr>
-                          <w:rFonts w:ascii="Cambria Math" w:eastAsia="Times New Roman" w:hAnsi="Cambria Math" w:cs="Arial"/>
-                          <w:sz w:val="28"/>
-                          <w:szCs w:val="28"/>
-                        </w:rPr>
-                        <m:t>,j</m:t>
+                        <m:t>i,j</m:t>
                       </m:r>
                     </m:e>
                   </m:d>
@@ -7724,63 +7794,7 @@
                       <w:sz w:val="28"/>
                       <w:szCs w:val="28"/>
                     </w:rPr>
-                    <m:t>+</m:t>
-                  </m:r>
-                  <m:r>
-                    <w:rPr>
-                      <w:rFonts w:ascii="Cambria Math" w:eastAsia="Times New Roman" w:hAnsi="Cambria Math" w:cs="Arial"/>
-                      <w:sz w:val="28"/>
-                      <w:szCs w:val="28"/>
-                    </w:rPr>
-                    <m:t>F</m:t>
-                  </m:r>
-                  <m:r>
-                    <w:rPr>
-                      <w:rFonts w:ascii="Cambria Math" w:eastAsia="Times New Roman" w:hAnsi="Cambria Math" w:cs="Arial"/>
-                      <w:sz w:val="28"/>
-                      <w:szCs w:val="28"/>
-                    </w:rPr>
-                    <m:t>k</m:t>
-                  </m:r>
-                  <m:r>
-                    <w:rPr>
-                      <w:rFonts w:ascii="Cambria Math" w:eastAsia="Times New Roman" w:hAnsi="Cambria Math" w:cs="Arial"/>
-                      <w:sz w:val="28"/>
-                      <w:szCs w:val="28"/>
-                    </w:rPr>
-                    <m:t>[</m:t>
-                  </m:r>
-                  <m:r>
-                    <w:rPr>
-                      <w:rFonts w:ascii="Cambria Math" w:eastAsia="Times New Roman" w:hAnsi="Cambria Math" w:cs="Arial"/>
-                      <w:sz w:val="28"/>
-                      <w:szCs w:val="28"/>
-                    </w:rPr>
-                    <m:t>k</m:t>
-                  </m:r>
-                  <m:r>
-                    <w:rPr>
-                      <w:rFonts w:ascii="Cambria Math" w:eastAsia="Times New Roman" w:hAnsi="Cambria Math" w:cs="Arial"/>
-                      <w:sz w:val="28"/>
-                      <w:szCs w:val="28"/>
-                    </w:rPr>
-                    <m:t>,</m:t>
-                  </m:r>
-                  <m:r>
-                    <w:rPr>
-                      <w:rFonts w:ascii="Cambria Math" w:eastAsia="Times New Roman" w:hAnsi="Cambria Math" w:cs="Arial"/>
-                      <w:sz w:val="28"/>
-                      <w:szCs w:val="28"/>
-                    </w:rPr>
-                    <m:t>j</m:t>
-                  </m:r>
-                  <m:r>
-                    <w:rPr>
-                      <w:rFonts w:ascii="Cambria Math" w:eastAsia="Times New Roman" w:hAnsi="Cambria Math" w:cs="Arial"/>
-                      <w:sz w:val="28"/>
-                      <w:szCs w:val="28"/>
-                    </w:rPr>
-                    <m:t>]</m:t>
+                    <m:t>+Fk[k,j]</m:t>
                   </m:r>
                 </m:e>
               </m:eqArr>
@@ -7832,15 +7846,7 @@
           <w:b/>
           <w:lang w:val="es-ES"/>
         </w:rPr>
-        <w:t xml:space="preserve">Algoritmo de </w:t>
-      </w:r>
-      <w:r>
-        <w:rPr>
-          <w:rFonts w:ascii="Arial" w:eastAsia="Times New Roman" w:hAnsi="Arial" w:cs="Arial"/>
-          <w:b/>
-          <w:lang w:val="es-ES"/>
-        </w:rPr>
-        <w:t>Warshall</w:t>
+        <w:t>Algoritmo de Warshall</w:t>
       </w:r>
     </w:p>
     <w:p>
@@ -8194,51 +8200,23 @@
           <w:rFonts w:ascii="Arial" w:eastAsia="Times New Roman" w:hAnsi="Arial" w:cs="Arial"/>
           <w:lang w:val="es-ES"/>
         </w:rPr>
-        <w:t xml:space="preserve">La pregunta que se hace el algoritmo de </w:t>
-      </w:r>
-      <w:r>
-        <w:rPr>
-          <w:rFonts w:ascii="Arial" w:eastAsia="Times New Roman" w:hAnsi="Arial" w:cs="Arial"/>
-          <w:lang w:val="es-ES"/>
-        </w:rPr>
-        <w:t>Warshall</w:t>
-      </w:r>
-      <w:r>
-        <w:rPr>
-          <w:rFonts w:ascii="Arial" w:eastAsia="Times New Roman" w:hAnsi="Arial" w:cs="Arial"/>
-          <w:lang w:val="es-ES"/>
-        </w:rPr>
-        <w:t xml:space="preserve"> es la siguiente:</w:t>
-      </w:r>
-    </w:p>
-    <w:p>
-      <w:pPr>
-        <w:spacing w:before="100" w:beforeAutospacing="1" w:after="100" w:afterAutospacing="1" w:line="240" w:lineRule="auto"/>
-        <w:rPr>
-          <w:rFonts w:ascii="Arial" w:eastAsia="Times New Roman" w:hAnsi="Arial" w:cs="Arial"/>
-          <w:lang w:val="es-ES"/>
-        </w:rPr>
-      </w:pPr>
-      <w:r>
-        <w:rPr>
-          <w:rFonts w:ascii="Arial" w:eastAsia="Times New Roman" w:hAnsi="Arial" w:cs="Arial"/>
-          <w:lang w:val="es-ES"/>
-        </w:rPr>
-        <w:t>¿</w:t>
-      </w:r>
-      <w:r>
-        <w:rPr>
-          <w:rFonts w:ascii="Arial" w:eastAsia="Times New Roman" w:hAnsi="Arial" w:cs="Arial"/>
-          <w:lang w:val="es-ES"/>
-        </w:rPr>
-        <w:t>Existe una conexión directa entre los nodos i y j, o una conexión indirecta entre i y j, pasando por k</w:t>
-      </w:r>
-      <w:r>
-        <w:rPr>
-          <w:rFonts w:ascii="Arial" w:eastAsia="Times New Roman" w:hAnsi="Arial" w:cs="Arial"/>
-          <w:lang w:val="es-ES"/>
-        </w:rPr>
-        <w:t>?</w:t>
+        <w:t>La pregunta que se hace el algoritmo de Warshall es la siguiente:</w:t>
+      </w:r>
+    </w:p>
+    <w:p>
+      <w:pPr>
+        <w:spacing w:before="100" w:beforeAutospacing="1" w:after="100" w:afterAutospacing="1" w:line="240" w:lineRule="auto"/>
+        <w:rPr>
+          <w:rFonts w:ascii="Arial" w:eastAsia="Times New Roman" w:hAnsi="Arial" w:cs="Arial"/>
+          <w:lang w:val="es-ES"/>
+        </w:rPr>
+      </w:pPr>
+      <w:r>
+        <w:rPr>
+          <w:rFonts w:ascii="Arial" w:eastAsia="Times New Roman" w:hAnsi="Arial" w:cs="Arial"/>
+          <w:lang w:val="es-ES"/>
+        </w:rPr>
+        <w:t>¿Existe una conexión directa entre los nodos i y j, o una conexión indirecta entre i y j, pasando por k?</w:t>
       </w:r>
     </w:p>
     <w:p>
@@ -8290,15 +8268,7 @@
               <w:sz w:val="28"/>
               <w:szCs w:val="28"/>
             </w:rPr>
-            <m:t>=</m:t>
-          </m:r>
-          <m:r>
-            <w:rPr>
-              <w:rFonts w:ascii="Cambria Math" w:eastAsia="Times New Roman" w:hAnsi="Cambria Math" w:cs="Arial"/>
-              <w:sz w:val="28"/>
-              <w:szCs w:val="28"/>
-            </w:rPr>
-            <m:t>A</m:t>
+            <m:t>=A</m:t>
           </m:r>
           <m:d>
             <m:dPr>
@@ -8330,15 +8300,7 @@
               <w:sz w:val="28"/>
               <w:szCs w:val="28"/>
             </w:rPr>
-            <m:t xml:space="preserve"> || (Ak[i,j] &amp;&amp;</m:t>
-          </m:r>
-          <m:r>
-            <w:rPr>
-              <w:rFonts w:ascii="Cambria Math" w:eastAsia="Times New Roman" w:hAnsi="Cambria Math" w:cs="Arial"/>
-              <w:sz w:val="28"/>
-              <w:szCs w:val="28"/>
-            </w:rPr>
-            <m:t xml:space="preserve"> Ak</m:t>
+            <m:t xml:space="preserve"> || (Ak[i,j] &amp;&amp; Ak</m:t>
           </m:r>
           <m:d>
             <m:dPr>
@@ -8812,21 +8774,7 @@
           <w:lang w:val="es-ES"/>
         </w:rPr>
         <w:lastRenderedPageBreak/>
-        <w:t xml:space="preserve">¿Qué cosas necesitamos para programar el algoritmo de </w:t>
-      </w:r>
-      <w:r>
-        <w:rPr>
-          <w:rFonts w:ascii="Arial" w:eastAsia="Times New Roman" w:hAnsi="Arial" w:cs="Arial"/>
-          <w:lang w:val="es-ES"/>
-        </w:rPr>
-        <w:t>coloración de Welsh-Powell</w:t>
-      </w:r>
-      <w:r>
-        <w:rPr>
-          <w:rFonts w:ascii="Arial" w:eastAsia="Times New Roman" w:hAnsi="Arial" w:cs="Arial"/>
-          <w:lang w:val="es-ES"/>
-        </w:rPr>
-        <w:t>?</w:t>
+        <w:t>¿Qué cosas necesitamos para programar el algoritmo de coloración de Welsh-Powell?</w:t>
       </w:r>
     </w:p>
     <w:p>
@@ -8907,23 +8855,7 @@
           <w:color w:val="70AD47" w:themeColor="accent6"/>
           <w:lang w:val="es-ES"/>
         </w:rPr>
-        <w:t>olor</w:t>
-      </w:r>
-      <w:r>
-        <w:rPr>
-          <w:rFonts w:ascii="Arial" w:eastAsia="Times New Roman" w:hAnsi="Arial" w:cs="Arial"/>
-          <w:color w:val="70AD47" w:themeColor="accent6"/>
-          <w:lang w:val="es-ES"/>
-        </w:rPr>
-        <w:t>, en caso de que queramos</w:t>
-      </w:r>
-      <w:r>
-        <w:rPr>
-          <w:rFonts w:ascii="Arial" w:eastAsia="Times New Roman" w:hAnsi="Arial" w:cs="Arial"/>
-          <w:color w:val="70AD47" w:themeColor="accent6"/>
-          <w:lang w:val="es-ES"/>
-        </w:rPr>
-        <w:t xml:space="preserve"> saber los colores que se usaron.</w:t>
+        <w:t>olor, en caso de que queramos saber los colores que se usaron.</w:t>
       </w:r>
     </w:p>
     <w:p>
@@ -9115,6 +9047,13 @@
           <w:lang w:val="es-ES"/>
         </w:rPr>
         <w:t>Es un bardo esto. Que lo explique otro.</w:t>
+      </w:r>
+      <w:r>
+        <w:rPr>
+          <w:rFonts w:ascii="Arial" w:eastAsia="Times New Roman" w:hAnsi="Arial" w:cs="Arial"/>
+          <w:lang w:val="es-ES"/>
+        </w:rPr>
+        <w:t xml:space="preserve"> O vean el código. O el libro ese de estructura de datos.</w:t>
       </w:r>
       <w:bookmarkStart w:id="0" w:name="_GoBack"/>
       <w:bookmarkEnd w:id="0"/>

</xml_diff>

<commit_message>
OIA Acortando el camino
</commit_message>
<xml_diff>
--- a/Códigos teoría/Grafos/Teoría de Grafos.docx
+++ b/Códigos teoría/Grafos/Teoría de Grafos.docx
@@ -912,14 +912,7 @@
           <w:rFonts w:ascii="Arial" w:hAnsi="Arial" w:cs="Arial"/>
           <w:lang w:val="es-ES"/>
         </w:rPr>
-        <w:t>U</w:t>
-      </w:r>
-      <w:r>
-        <w:rPr>
-          <w:rFonts w:ascii="Arial" w:hAnsi="Arial" w:cs="Arial"/>
-          <w:lang w:val="es-ES"/>
-        </w:rPr>
-        <w:t xml:space="preserve">n </w:t>
+        <w:t xml:space="preserve">Un </w:t>
       </w:r>
       <w:r>
         <w:rPr>
@@ -6713,8 +6706,10 @@
           <w:rFonts w:ascii="Arial" w:eastAsia="Times New Roman" w:hAnsi="Arial" w:cs="Arial"/>
           <w:lang w:val="es-ES"/>
         </w:rPr>
-        <w:t>BFS</w:t>
-      </w:r>
+        <w:t>DFS</w:t>
+      </w:r>
+      <w:bookmarkStart w:id="0" w:name="_GoBack"/>
+      <w:bookmarkEnd w:id="0"/>
       <w:r>
         <w:rPr>
           <w:rFonts w:ascii="Arial" w:eastAsia="Times New Roman" w:hAnsi="Arial" w:cs="Arial"/>
@@ -9055,8 +9050,6 @@
         </w:rPr>
         <w:t xml:space="preserve"> O vean el código. O el libro ese de estructura de datos.</w:t>
       </w:r>
-      <w:bookmarkStart w:id="0" w:name="_GoBack"/>
-      <w:bookmarkEnd w:id="0"/>
     </w:p>
     <w:p>
       <w:pPr>

</xml_diff>

<commit_message>
Teoria de grafos actualizada
</commit_message>
<xml_diff>
--- a/Códigos teoría/Grafos/Teoría de Grafos.docx
+++ b/Códigos teoría/Grafos/Teoría de Grafos.docx
@@ -6708,8 +6708,6 @@
         </w:rPr>
         <w:t>DFS</w:t>
       </w:r>
-      <w:bookmarkStart w:id="0" w:name="_GoBack"/>
-      <w:bookmarkEnd w:id="0"/>
       <w:r>
         <w:rPr>
           <w:rFonts w:ascii="Arial" w:eastAsia="Times New Roman" w:hAnsi="Arial" w:cs="Arial"/>
@@ -9070,6 +9068,709 @@
           <w:lang w:val="es-ES"/>
         </w:rPr>
       </w:pPr>
+    </w:p>
+    <w:p>
+      <w:pPr>
+        <w:spacing w:before="100" w:beforeAutospacing="1" w:after="100" w:afterAutospacing="1" w:line="240" w:lineRule="auto"/>
+        <w:rPr>
+          <w:rFonts w:ascii="Arial" w:eastAsia="Times New Roman" w:hAnsi="Arial" w:cs="Arial"/>
+          <w:b/>
+          <w:lang w:val="es-ES"/>
+        </w:rPr>
+      </w:pPr>
+    </w:p>
+    <w:p>
+      <w:pPr>
+        <w:spacing w:before="100" w:beforeAutospacing="1" w:after="100" w:afterAutospacing="1" w:line="240" w:lineRule="auto"/>
+        <w:rPr>
+          <w:rFonts w:ascii="Arial" w:eastAsia="Times New Roman" w:hAnsi="Arial" w:cs="Arial"/>
+          <w:b/>
+          <w:lang w:val="es-ES"/>
+        </w:rPr>
+      </w:pPr>
+    </w:p>
+    <w:p>
+      <w:pPr>
+        <w:spacing w:before="100" w:beforeAutospacing="1" w:after="100" w:afterAutospacing="1" w:line="240" w:lineRule="auto"/>
+        <w:rPr>
+          <w:rFonts w:ascii="Arial" w:eastAsia="Times New Roman" w:hAnsi="Arial" w:cs="Arial"/>
+          <w:b/>
+          <w:lang w:val="es-ES"/>
+        </w:rPr>
+      </w:pPr>
+    </w:p>
+    <w:p>
+      <w:pPr>
+        <w:spacing w:before="100" w:beforeAutospacing="1" w:after="100" w:afterAutospacing="1" w:line="240" w:lineRule="auto"/>
+        <w:rPr>
+          <w:rFonts w:ascii="Arial" w:eastAsia="Times New Roman" w:hAnsi="Arial" w:cs="Arial"/>
+          <w:b/>
+          <w:lang w:val="es-ES"/>
+        </w:rPr>
+      </w:pPr>
+    </w:p>
+    <w:p>
+      <w:pPr>
+        <w:spacing w:before="100" w:beforeAutospacing="1" w:after="100" w:afterAutospacing="1" w:line="240" w:lineRule="auto"/>
+        <w:rPr>
+          <w:rFonts w:ascii="Arial" w:eastAsia="Times New Roman" w:hAnsi="Arial" w:cs="Arial"/>
+          <w:b/>
+          <w:lang w:val="es-ES"/>
+        </w:rPr>
+      </w:pPr>
+    </w:p>
+    <w:p>
+      <w:pPr>
+        <w:spacing w:before="100" w:beforeAutospacing="1" w:after="100" w:afterAutospacing="1" w:line="240" w:lineRule="auto"/>
+        <w:rPr>
+          <w:rFonts w:ascii="Arial" w:eastAsia="Times New Roman" w:hAnsi="Arial" w:cs="Arial"/>
+          <w:b/>
+          <w:lang w:val="es-ES"/>
+        </w:rPr>
+      </w:pPr>
+    </w:p>
+    <w:p>
+      <w:pPr>
+        <w:spacing w:before="100" w:beforeAutospacing="1" w:after="100" w:afterAutospacing="1" w:line="240" w:lineRule="auto"/>
+        <w:rPr>
+          <w:rFonts w:ascii="Arial" w:eastAsia="Times New Roman" w:hAnsi="Arial" w:cs="Arial"/>
+          <w:b/>
+          <w:lang w:val="es-ES"/>
+        </w:rPr>
+      </w:pPr>
+    </w:p>
+    <w:p>
+      <w:pPr>
+        <w:spacing w:before="100" w:beforeAutospacing="1" w:after="100" w:afterAutospacing="1" w:line="240" w:lineRule="auto"/>
+        <w:rPr>
+          <w:rFonts w:ascii="Arial" w:eastAsia="Times New Roman" w:hAnsi="Arial" w:cs="Arial"/>
+          <w:b/>
+          <w:lang w:val="es-ES"/>
+        </w:rPr>
+      </w:pPr>
+    </w:p>
+    <w:p>
+      <w:pPr>
+        <w:spacing w:before="100" w:beforeAutospacing="1" w:after="100" w:afterAutospacing="1" w:line="240" w:lineRule="auto"/>
+        <w:rPr>
+          <w:rFonts w:ascii="Arial" w:eastAsia="Times New Roman" w:hAnsi="Arial" w:cs="Arial"/>
+          <w:b/>
+          <w:lang w:val="es-ES"/>
+        </w:rPr>
+      </w:pPr>
+    </w:p>
+    <w:p>
+      <w:pPr>
+        <w:spacing w:before="100" w:beforeAutospacing="1" w:after="100" w:afterAutospacing="1" w:line="240" w:lineRule="auto"/>
+        <w:rPr>
+          <w:rFonts w:ascii="Arial" w:eastAsia="Times New Roman" w:hAnsi="Arial" w:cs="Arial"/>
+          <w:b/>
+          <w:lang w:val="es-ES"/>
+        </w:rPr>
+      </w:pPr>
+    </w:p>
+    <w:p>
+      <w:pPr>
+        <w:spacing w:before="100" w:beforeAutospacing="1" w:after="100" w:afterAutospacing="1" w:line="240" w:lineRule="auto"/>
+        <w:rPr>
+          <w:rFonts w:ascii="Arial" w:eastAsia="Times New Roman" w:hAnsi="Arial" w:cs="Arial"/>
+          <w:b/>
+          <w:u w:val="single"/>
+          <w:lang w:val="es-ES"/>
+        </w:rPr>
+      </w:pPr>
+      <w:r>
+        <w:rPr>
+          <w:rFonts w:ascii="Arial" w:eastAsia="Times New Roman" w:hAnsi="Arial" w:cs="Arial"/>
+          <w:b/>
+          <w:u w:val="single"/>
+          <w:lang w:val="es-ES"/>
+        </w:rPr>
+        <w:lastRenderedPageBreak/>
+        <w:t>Complejidad Computacional de los algoritmos</w:t>
+      </w:r>
+    </w:p>
+    <w:p>
+      <w:pPr>
+        <w:spacing w:before="100" w:beforeAutospacing="1" w:after="100" w:afterAutospacing="1" w:line="240" w:lineRule="auto"/>
+        <w:rPr>
+          <w:rFonts w:ascii="Arial" w:eastAsia="Times New Roman" w:hAnsi="Arial" w:cs="Arial"/>
+          <w:i/>
+          <w:lang w:val="es-ES"/>
+        </w:rPr>
+      </w:pPr>
+      <w:r>
+        <w:rPr>
+          <w:rFonts w:ascii="Arial" w:eastAsia="Times New Roman" w:hAnsi="Arial" w:cs="Arial"/>
+          <w:i/>
+          <w:lang w:val="es-ES"/>
+        </w:rPr>
+        <w:t>Teniendo en cuenta que se usa una matriz de adyacencia.</w:t>
+      </w:r>
+    </w:p>
+    <w:tbl>
+      <w:tblPr>
+        <w:tblStyle w:val="Tablaconcuadrcula"/>
+        <w:tblW w:w="0" w:type="auto"/>
+        <w:tblLook w:val="04A0" w:firstRow="1" w:lastRow="0" w:firstColumn="1" w:lastColumn="0" w:noHBand="0" w:noVBand="1"/>
+      </w:tblPr>
+      <w:tblGrid>
+        <w:gridCol w:w="4675"/>
+        <w:gridCol w:w="4675"/>
+      </w:tblGrid>
+      <w:tr>
+        <w:tc>
+          <w:tcPr>
+            <w:tcW w:w="4675" w:type="dxa"/>
+          </w:tcPr>
+          <w:p>
+            <w:pPr>
+              <w:spacing w:before="100" w:beforeAutospacing="1" w:after="100" w:afterAutospacing="1"/>
+              <w:jc w:val="center"/>
+              <w:rPr>
+                <w:rFonts w:ascii="Arial" w:eastAsia="Times New Roman" w:hAnsi="Arial" w:cs="Arial"/>
+                <w:b/>
+                <w:lang w:val="es-ES"/>
+              </w:rPr>
+            </w:pPr>
+            <w:r>
+              <w:rPr>
+                <w:rFonts w:ascii="Arial" w:eastAsia="Times New Roman" w:hAnsi="Arial" w:cs="Arial"/>
+                <w:b/>
+                <w:lang w:val="es-ES"/>
+              </w:rPr>
+              <w:t>Algoritmo</w:t>
+            </w:r>
+          </w:p>
+        </w:tc>
+        <w:tc>
+          <w:tcPr>
+            <w:tcW w:w="4675" w:type="dxa"/>
+          </w:tcPr>
+          <w:p>
+            <w:pPr>
+              <w:spacing w:before="100" w:beforeAutospacing="1" w:after="100" w:afterAutospacing="1"/>
+              <w:jc w:val="center"/>
+              <w:rPr>
+                <w:rFonts w:ascii="Arial" w:eastAsia="Times New Roman" w:hAnsi="Arial" w:cs="Arial"/>
+                <w:b/>
+                <w:lang w:val="es-ES"/>
+              </w:rPr>
+            </w:pPr>
+            <w:r>
+              <w:rPr>
+                <w:rFonts w:ascii="Arial" w:eastAsia="Times New Roman" w:hAnsi="Arial" w:cs="Arial"/>
+                <w:b/>
+                <w:lang w:val="es-ES"/>
+              </w:rPr>
+              <w:t>Complejidad</w:t>
+            </w:r>
+          </w:p>
+        </w:tc>
+      </w:tr>
+      <w:tr>
+        <w:tc>
+          <w:tcPr>
+            <w:tcW w:w="4675" w:type="dxa"/>
+          </w:tcPr>
+          <w:p>
+            <w:pPr>
+              <w:spacing w:before="100" w:beforeAutospacing="1" w:after="100" w:afterAutospacing="1"/>
+              <w:jc w:val="center"/>
+              <w:rPr>
+                <w:rFonts w:ascii="Arial" w:eastAsia="Times New Roman" w:hAnsi="Arial" w:cs="Arial"/>
+                <w:lang w:val="es-ES"/>
+              </w:rPr>
+            </w:pPr>
+            <w:r>
+              <w:rPr>
+                <w:rFonts w:ascii="Arial" w:eastAsia="Times New Roman" w:hAnsi="Arial" w:cs="Arial"/>
+                <w:lang w:val="es-ES"/>
+              </w:rPr>
+              <w:t>Dijkstra</w:t>
+            </w:r>
+          </w:p>
+        </w:tc>
+        <w:tc>
+          <w:tcPr>
+            <w:tcW w:w="4675" w:type="dxa"/>
+          </w:tcPr>
+          <w:p>
+            <w:pPr>
+              <w:spacing w:before="100" w:beforeAutospacing="1" w:after="100" w:afterAutospacing="1"/>
+              <w:jc w:val="center"/>
+              <w:rPr>
+                <w:rFonts w:ascii="Arial" w:eastAsia="Times New Roman" w:hAnsi="Arial" w:cs="Arial"/>
+                <w:vertAlign w:val="superscript"/>
+                <w:lang w:val="es-ES"/>
+              </w:rPr>
+            </w:pPr>
+            <w:r>
+              <w:rPr>
+                <w:rFonts w:ascii="Arial" w:eastAsia="Times New Roman" w:hAnsi="Arial" w:cs="Arial"/>
+                <w:lang w:val="es-ES"/>
+              </w:rPr>
+              <w:t>N</w:t>
+            </w:r>
+            <w:r>
+              <w:rPr>
+                <w:rFonts w:ascii="Arial" w:eastAsia="Times New Roman" w:hAnsi="Arial" w:cs="Arial"/>
+                <w:vertAlign w:val="superscript"/>
+                <w:lang w:val="es-ES"/>
+              </w:rPr>
+              <w:t>2</w:t>
+            </w:r>
+          </w:p>
+        </w:tc>
+      </w:tr>
+      <w:tr>
+        <w:tc>
+          <w:tcPr>
+            <w:tcW w:w="4675" w:type="dxa"/>
+          </w:tcPr>
+          <w:p>
+            <w:pPr>
+              <w:spacing w:before="100" w:beforeAutospacing="1" w:after="100" w:afterAutospacing="1"/>
+              <w:jc w:val="center"/>
+              <w:rPr>
+                <w:rFonts w:ascii="Arial" w:eastAsia="Times New Roman" w:hAnsi="Arial" w:cs="Arial"/>
+                <w:lang w:val="es-ES"/>
+              </w:rPr>
+            </w:pPr>
+            <w:r>
+              <w:rPr>
+                <w:rFonts w:ascii="Arial" w:eastAsia="Times New Roman" w:hAnsi="Arial" w:cs="Arial"/>
+                <w:lang w:val="es-ES"/>
+              </w:rPr>
+              <w:t>Prim</w:t>
+            </w:r>
+          </w:p>
+        </w:tc>
+        <w:tc>
+          <w:tcPr>
+            <w:tcW w:w="4675" w:type="dxa"/>
+          </w:tcPr>
+          <w:p>
+            <w:pPr>
+              <w:spacing w:before="100" w:beforeAutospacing="1" w:after="100" w:afterAutospacing="1"/>
+              <w:jc w:val="center"/>
+              <w:rPr>
+                <w:rFonts w:ascii="Arial" w:eastAsia="Times New Roman" w:hAnsi="Arial" w:cs="Arial"/>
+                <w:lang w:val="es-ES"/>
+              </w:rPr>
+            </w:pPr>
+            <w:r>
+              <w:rPr>
+                <w:rFonts w:ascii="Arial" w:eastAsia="Times New Roman" w:hAnsi="Arial" w:cs="Arial"/>
+                <w:lang w:val="es-ES"/>
+              </w:rPr>
+              <w:t>N</w:t>
+            </w:r>
+            <w:r>
+              <w:rPr>
+                <w:rFonts w:ascii="Arial" w:eastAsia="Times New Roman" w:hAnsi="Arial" w:cs="Arial"/>
+                <w:vertAlign w:val="superscript"/>
+                <w:lang w:val="es-ES"/>
+              </w:rPr>
+              <w:t>2</w:t>
+            </w:r>
+          </w:p>
+        </w:tc>
+      </w:tr>
+      <w:tr>
+        <w:tc>
+          <w:tcPr>
+            <w:tcW w:w="4675" w:type="dxa"/>
+          </w:tcPr>
+          <w:p>
+            <w:pPr>
+              <w:spacing w:before="100" w:beforeAutospacing="1" w:after="100" w:afterAutospacing="1"/>
+              <w:jc w:val="center"/>
+              <w:rPr>
+                <w:rFonts w:ascii="Arial" w:eastAsia="Times New Roman" w:hAnsi="Arial" w:cs="Arial"/>
+                <w:lang w:val="es-ES"/>
+              </w:rPr>
+            </w:pPr>
+            <w:r>
+              <w:rPr>
+                <w:rFonts w:ascii="Arial" w:eastAsia="Times New Roman" w:hAnsi="Arial" w:cs="Arial"/>
+                <w:lang w:val="es-ES"/>
+              </w:rPr>
+              <w:t>Kruskal</w:t>
+            </w:r>
+          </w:p>
+        </w:tc>
+        <w:tc>
+          <w:tcPr>
+            <w:tcW w:w="4675" w:type="dxa"/>
+          </w:tcPr>
+          <w:p>
+            <w:pPr>
+              <w:spacing w:before="100" w:beforeAutospacing="1" w:after="100" w:afterAutospacing="1"/>
+              <w:jc w:val="center"/>
+              <w:rPr>
+                <w:rFonts w:ascii="Arial" w:eastAsia="Times New Roman" w:hAnsi="Arial" w:cs="Arial"/>
+                <w:lang w:val="es-ES"/>
+              </w:rPr>
+            </w:pPr>
+            <w:r>
+              <w:rPr>
+                <w:rFonts w:ascii="Arial" w:eastAsia="Times New Roman" w:hAnsi="Arial" w:cs="Arial"/>
+                <w:lang w:val="es-ES"/>
+              </w:rPr>
+              <w:t>N</w:t>
+            </w:r>
+            <w:r>
+              <w:rPr>
+                <w:rFonts w:ascii="Arial" w:eastAsia="Times New Roman" w:hAnsi="Arial" w:cs="Arial"/>
+                <w:vertAlign w:val="superscript"/>
+                <w:lang w:val="es-ES"/>
+              </w:rPr>
+              <w:t>2</w:t>
+            </w:r>
+          </w:p>
+        </w:tc>
+      </w:tr>
+      <w:tr>
+        <w:tc>
+          <w:tcPr>
+            <w:tcW w:w="4675" w:type="dxa"/>
+          </w:tcPr>
+          <w:p>
+            <w:pPr>
+              <w:spacing w:before="100" w:beforeAutospacing="1" w:after="100" w:afterAutospacing="1"/>
+              <w:jc w:val="center"/>
+              <w:rPr>
+                <w:rFonts w:ascii="Arial" w:eastAsia="Times New Roman" w:hAnsi="Arial" w:cs="Arial"/>
+                <w:lang w:val="es-ES"/>
+              </w:rPr>
+            </w:pPr>
+            <w:r>
+              <w:rPr>
+                <w:rFonts w:ascii="Arial" w:eastAsia="Times New Roman" w:hAnsi="Arial" w:cs="Arial"/>
+                <w:lang w:val="es-ES"/>
+              </w:rPr>
+              <w:t>BFS</w:t>
+            </w:r>
+          </w:p>
+        </w:tc>
+        <w:tc>
+          <w:tcPr>
+            <w:tcW w:w="4675" w:type="dxa"/>
+          </w:tcPr>
+          <w:p>
+            <w:pPr>
+              <w:spacing w:before="100" w:beforeAutospacing="1" w:after="100" w:afterAutospacing="1"/>
+              <w:jc w:val="center"/>
+              <w:rPr>
+                <w:rFonts w:ascii="Arial" w:eastAsia="Times New Roman" w:hAnsi="Arial" w:cs="Arial"/>
+                <w:vertAlign w:val="superscript"/>
+                <w:lang w:val="es-ES"/>
+              </w:rPr>
+            </w:pPr>
+            <w:r>
+              <w:rPr>
+                <w:rFonts w:ascii="Arial" w:eastAsia="Times New Roman" w:hAnsi="Arial" w:cs="Arial"/>
+                <w:lang w:val="es-ES"/>
+              </w:rPr>
+              <w:t>N</w:t>
+            </w:r>
+            <w:r>
+              <w:rPr>
+                <w:rFonts w:ascii="Arial" w:eastAsia="Times New Roman" w:hAnsi="Arial" w:cs="Arial"/>
+                <w:vertAlign w:val="superscript"/>
+                <w:lang w:val="es-ES"/>
+              </w:rPr>
+              <w:t>2</w:t>
+            </w:r>
+          </w:p>
+        </w:tc>
+      </w:tr>
+      <w:tr>
+        <w:tc>
+          <w:tcPr>
+            <w:tcW w:w="4675" w:type="dxa"/>
+          </w:tcPr>
+          <w:p>
+            <w:pPr>
+              <w:spacing w:before="100" w:beforeAutospacing="1" w:after="100" w:afterAutospacing="1"/>
+              <w:jc w:val="center"/>
+              <w:rPr>
+                <w:rFonts w:ascii="Arial" w:eastAsia="Times New Roman" w:hAnsi="Arial" w:cs="Arial"/>
+                <w:lang w:val="es-ES"/>
+              </w:rPr>
+            </w:pPr>
+            <w:r>
+              <w:rPr>
+                <w:rFonts w:ascii="Arial" w:eastAsia="Times New Roman" w:hAnsi="Arial" w:cs="Arial"/>
+                <w:lang w:val="es-ES"/>
+              </w:rPr>
+              <w:t>DFS</w:t>
+            </w:r>
+          </w:p>
+        </w:tc>
+        <w:tc>
+          <w:tcPr>
+            <w:tcW w:w="4675" w:type="dxa"/>
+          </w:tcPr>
+          <w:p>
+            <w:pPr>
+              <w:spacing w:before="100" w:beforeAutospacing="1" w:after="100" w:afterAutospacing="1"/>
+              <w:jc w:val="center"/>
+              <w:rPr>
+                <w:rFonts w:ascii="Arial" w:eastAsia="Times New Roman" w:hAnsi="Arial" w:cs="Arial"/>
+                <w:lang w:val="es-ES"/>
+              </w:rPr>
+            </w:pPr>
+            <w:r>
+              <w:rPr>
+                <w:rFonts w:ascii="Arial" w:eastAsia="Times New Roman" w:hAnsi="Arial" w:cs="Arial"/>
+                <w:lang w:val="es-ES"/>
+              </w:rPr>
+              <w:t>N</w:t>
+            </w:r>
+            <w:r>
+              <w:rPr>
+                <w:rFonts w:ascii="Arial" w:eastAsia="Times New Roman" w:hAnsi="Arial" w:cs="Arial"/>
+                <w:vertAlign w:val="superscript"/>
+                <w:lang w:val="es-ES"/>
+              </w:rPr>
+              <w:t>2</w:t>
+            </w:r>
+          </w:p>
+        </w:tc>
+      </w:tr>
+      <w:tr>
+        <w:tc>
+          <w:tcPr>
+            <w:tcW w:w="4675" w:type="dxa"/>
+          </w:tcPr>
+          <w:p>
+            <w:pPr>
+              <w:spacing w:before="100" w:beforeAutospacing="1" w:after="100" w:afterAutospacing="1"/>
+              <w:jc w:val="center"/>
+              <w:rPr>
+                <w:rFonts w:ascii="Arial" w:eastAsia="Times New Roman" w:hAnsi="Arial" w:cs="Arial"/>
+                <w:lang w:val="es-ES"/>
+              </w:rPr>
+            </w:pPr>
+            <w:r>
+              <w:rPr>
+                <w:rFonts w:ascii="Arial" w:eastAsia="Times New Roman" w:hAnsi="Arial" w:cs="Arial"/>
+                <w:lang w:val="es-ES"/>
+              </w:rPr>
+              <w:t>Floyd</w:t>
+            </w:r>
+          </w:p>
+        </w:tc>
+        <w:tc>
+          <w:tcPr>
+            <w:tcW w:w="4675" w:type="dxa"/>
+          </w:tcPr>
+          <w:p>
+            <w:pPr>
+              <w:spacing w:before="100" w:beforeAutospacing="1" w:after="100" w:afterAutospacing="1"/>
+              <w:jc w:val="center"/>
+              <w:rPr>
+                <w:rFonts w:ascii="Arial" w:eastAsia="Times New Roman" w:hAnsi="Arial" w:cs="Arial"/>
+                <w:lang w:val="es-ES"/>
+              </w:rPr>
+            </w:pPr>
+            <w:r>
+              <w:rPr>
+                <w:rFonts w:ascii="Arial" w:eastAsia="Times New Roman" w:hAnsi="Arial" w:cs="Arial"/>
+                <w:lang w:val="es-ES"/>
+              </w:rPr>
+              <w:t>N</w:t>
+            </w:r>
+            <w:r>
+              <w:rPr>
+                <w:rFonts w:ascii="Arial" w:eastAsia="Times New Roman" w:hAnsi="Arial" w:cs="Arial"/>
+                <w:vertAlign w:val="superscript"/>
+                <w:lang w:val="es-ES"/>
+              </w:rPr>
+              <w:t>3</w:t>
+            </w:r>
+          </w:p>
+        </w:tc>
+      </w:tr>
+      <w:tr>
+        <w:tc>
+          <w:tcPr>
+            <w:tcW w:w="4675" w:type="dxa"/>
+          </w:tcPr>
+          <w:p>
+            <w:pPr>
+              <w:spacing w:before="100" w:beforeAutospacing="1" w:after="100" w:afterAutospacing="1"/>
+              <w:jc w:val="center"/>
+              <w:rPr>
+                <w:rFonts w:ascii="Arial" w:eastAsia="Times New Roman" w:hAnsi="Arial" w:cs="Arial"/>
+                <w:lang w:val="es-ES"/>
+              </w:rPr>
+            </w:pPr>
+            <w:r>
+              <w:rPr>
+                <w:rFonts w:ascii="Arial" w:eastAsia="Times New Roman" w:hAnsi="Arial" w:cs="Arial"/>
+                <w:lang w:val="es-ES"/>
+              </w:rPr>
+              <w:t>Warshall</w:t>
+            </w:r>
+          </w:p>
+        </w:tc>
+        <w:tc>
+          <w:tcPr>
+            <w:tcW w:w="4675" w:type="dxa"/>
+          </w:tcPr>
+          <w:p>
+            <w:pPr>
+              <w:spacing w:before="100" w:beforeAutospacing="1" w:after="100" w:afterAutospacing="1"/>
+              <w:jc w:val="center"/>
+              <w:rPr>
+                <w:rFonts w:ascii="Arial" w:eastAsia="Times New Roman" w:hAnsi="Arial" w:cs="Arial"/>
+                <w:lang w:val="es-ES"/>
+              </w:rPr>
+            </w:pPr>
+            <w:r>
+              <w:rPr>
+                <w:rFonts w:ascii="Arial" w:eastAsia="Times New Roman" w:hAnsi="Arial" w:cs="Arial"/>
+                <w:lang w:val="es-ES"/>
+              </w:rPr>
+              <w:t>N</w:t>
+            </w:r>
+            <w:r>
+              <w:rPr>
+                <w:rFonts w:ascii="Arial" w:eastAsia="Times New Roman" w:hAnsi="Arial" w:cs="Arial"/>
+                <w:vertAlign w:val="superscript"/>
+                <w:lang w:val="es-ES"/>
+              </w:rPr>
+              <w:t>3</w:t>
+            </w:r>
+          </w:p>
+        </w:tc>
+      </w:tr>
+      <w:tr>
+        <w:tc>
+          <w:tcPr>
+            <w:tcW w:w="4675" w:type="dxa"/>
+          </w:tcPr>
+          <w:p>
+            <w:pPr>
+              <w:spacing w:before="100" w:beforeAutospacing="1" w:after="100" w:afterAutospacing="1"/>
+              <w:jc w:val="center"/>
+              <w:rPr>
+                <w:rFonts w:ascii="Arial" w:eastAsia="Times New Roman" w:hAnsi="Arial" w:cs="Arial"/>
+                <w:lang w:val="es-ES"/>
+              </w:rPr>
+            </w:pPr>
+            <w:r>
+              <w:rPr>
+                <w:rFonts w:ascii="Arial" w:eastAsia="Times New Roman" w:hAnsi="Arial" w:cs="Arial"/>
+                <w:lang w:val="es-ES"/>
+              </w:rPr>
+              <w:t>Coloreo</w:t>
+            </w:r>
+          </w:p>
+        </w:tc>
+        <w:tc>
+          <w:tcPr>
+            <w:tcW w:w="4675" w:type="dxa"/>
+          </w:tcPr>
+          <w:p>
+            <w:pPr>
+              <w:spacing w:before="100" w:beforeAutospacing="1" w:after="100" w:afterAutospacing="1"/>
+              <w:jc w:val="center"/>
+              <w:rPr>
+                <w:rFonts w:ascii="Arial" w:eastAsia="Times New Roman" w:hAnsi="Arial" w:cs="Arial"/>
+                <w:lang w:val="es-ES"/>
+              </w:rPr>
+            </w:pPr>
+            <w:r>
+              <w:rPr>
+                <w:rFonts w:ascii="Arial" w:eastAsia="Times New Roman" w:hAnsi="Arial" w:cs="Arial"/>
+                <w:lang w:val="es-ES"/>
+              </w:rPr>
+              <w:t>N</w:t>
+            </w:r>
+            <w:r>
+              <w:rPr>
+                <w:rFonts w:ascii="Arial" w:eastAsia="Times New Roman" w:hAnsi="Arial" w:cs="Arial"/>
+                <w:vertAlign w:val="superscript"/>
+                <w:lang w:val="es-ES"/>
+              </w:rPr>
+              <w:t>2</w:t>
+            </w:r>
+            <w:r>
+              <w:rPr>
+                <w:rFonts w:ascii="Arial" w:eastAsia="Times New Roman" w:hAnsi="Arial" w:cs="Arial"/>
+                <w:lang w:val="es-ES"/>
+              </w:rPr>
+              <w:t xml:space="preserve">/ </w:t>
+            </w:r>
+            <w:r>
+              <w:rPr>
+                <w:rFonts w:ascii="Arial" w:eastAsia="Times New Roman" w:hAnsi="Arial" w:cs="Arial"/>
+                <w:lang w:val="es-ES"/>
+              </w:rPr>
+              <w:t>N</w:t>
+            </w:r>
+            <w:r>
+              <w:rPr>
+                <w:rFonts w:ascii="Arial" w:eastAsia="Times New Roman" w:hAnsi="Arial" w:cs="Arial"/>
+                <w:vertAlign w:val="superscript"/>
+                <w:lang w:val="es-ES"/>
+              </w:rPr>
+              <w:t>3</w:t>
+            </w:r>
+          </w:p>
+        </w:tc>
+      </w:tr>
+    </w:tbl>
+    <w:p>
+      <w:pPr>
+        <w:spacing w:before="100" w:beforeAutospacing="1" w:after="100" w:afterAutospacing="1" w:line="240" w:lineRule="auto"/>
+        <w:rPr>
+          <w:rFonts w:ascii="Arial" w:eastAsia="Times New Roman" w:hAnsi="Arial" w:cs="Arial"/>
+          <w:lang w:val="es-ES"/>
+        </w:rPr>
+      </w:pPr>
+      <w:r>
+        <w:rPr>
+          <w:rFonts w:ascii="Arial" w:eastAsia="Times New Roman" w:hAnsi="Arial" w:cs="Arial"/>
+          <w:lang w:val="es-ES"/>
+        </w:rPr>
+        <w:t>El algoritmo de coloreo, dependiendo de cómo lo encares, tiene más o menos complejidad.</w:t>
+      </w:r>
+      <w:r>
+        <w:rPr>
+          <w:rFonts w:ascii="Arial" w:eastAsia="Times New Roman" w:hAnsi="Arial" w:cs="Arial"/>
+          <w:lang w:val="es-ES"/>
+        </w:rPr>
+        <w:t xml:space="preserve"> </w:t>
+      </w:r>
+      <w:r>
+        <w:rPr>
+          <w:rFonts w:ascii="Arial" w:eastAsia="Times New Roman" w:hAnsi="Arial" w:cs="Arial"/>
+          <w:lang w:val="es-ES"/>
+        </w:rPr>
+        <w:t>Yo apunto a que es N</w:t>
+      </w:r>
+      <w:r>
+        <w:rPr>
+          <w:rFonts w:ascii="Arial" w:eastAsia="Times New Roman" w:hAnsi="Arial" w:cs="Arial"/>
+          <w:vertAlign w:val="superscript"/>
+          <w:lang w:val="es-ES"/>
+        </w:rPr>
+        <w:t>2</w:t>
+      </w:r>
+      <w:r>
+        <w:rPr>
+          <w:rFonts w:ascii="Arial" w:eastAsia="Times New Roman" w:hAnsi="Arial" w:cs="Arial"/>
+          <w:lang w:val="es-ES"/>
+        </w:rPr>
+        <w:t>.</w:t>
+      </w:r>
+      <w:bookmarkStart w:id="0" w:name="_GoBack"/>
+      <w:bookmarkEnd w:id="0"/>
     </w:p>
     <w:sectPr>
       <w:pgSz w:w="12240" w:h="15840"/>
@@ -11502,6 +12203,25 @@
       <w:color w:val="808080"/>
     </w:rPr>
   </w:style>
+  <w:style w:type="table" w:styleId="Tablaconcuadrcula">
+    <w:name w:val="Table Grid"/>
+    <w:basedOn w:val="Tablanormal"/>
+    <w:uiPriority w:val="39"/>
+    <w:rsid w:val="009A3433"/>
+    <w:pPr>
+      <w:spacing w:after="0" w:line="240" w:lineRule="auto"/>
+    </w:pPr>
+    <w:tblPr>
+      <w:tblBorders>
+        <w:top w:val="single" w:sz="4" w:space="0" w:color="auto"/>
+        <w:left w:val="single" w:sz="4" w:space="0" w:color="auto"/>
+        <w:bottom w:val="single" w:sz="4" w:space="0" w:color="auto"/>
+        <w:right w:val="single" w:sz="4" w:space="0" w:color="auto"/>
+        <w:insideH w:val="single" w:sz="4" w:space="0" w:color="auto"/>
+        <w:insideV w:val="single" w:sz="4" w:space="0" w:color="auto"/>
+      </w:tblBorders>
+    </w:tblPr>
+  </w:style>
 </w:styles>
 </file>
 

</xml_diff>